<commit_message>
Revisió i actualització curs 2025-2026 Guia Docent Professorat
</commit_message>
<xml_diff>
--- a/_recursos_originals/Guia_Desplegament_KarmaWebApi_Docker.docx
+++ b/_recursos_originals/Guia_Desplegament_KarmaWebApi_Docker.docx
@@ -2,52 +2,1141 @@
 <file path=word/document.xml><?xml version="1.0" encoding="utf-8"?>
 <w:document xmlns:wpc="http://schemas.microsoft.com/office/word/2010/wordprocessingCanvas" xmlns:cx="http://schemas.microsoft.com/office/drawing/2014/chartex" xmlns:cx1="http://schemas.microsoft.com/office/drawing/2015/9/8/chartex" xmlns:cx2="http://schemas.microsoft.com/office/drawing/2015/10/21/chartex" xmlns:cx3="http://schemas.microsoft.com/office/drawing/2016/5/9/chartex" xmlns:cx4="http://schemas.microsoft.com/office/drawing/2016/5/10/chartex" xmlns:cx5="http://schemas.microsoft.com/office/drawing/2016/5/11/chartex" xmlns:cx6="http://schemas.microsoft.com/office/drawing/2016/5/12/chartex" xmlns:cx7="http://schemas.microsoft.com/office/drawing/2016/5/13/chartex" xmlns:cx8="http://schemas.microsoft.com/office/drawing/2016/5/14/chartex" xmlns:mc="http://schemas.openxmlformats.org/markup-compatibility/2006" xmlns:aink="http://schemas.microsoft.com/office/drawing/2016/ink" xmlns:am3d="http://schemas.microsoft.com/office/drawing/2017/model3d" xmlns:o="urn:schemas-microsoft-com:office:office" xmlns:oel="http://schemas.microsoft.com/office/2019/extlst" xmlns:r="http://schemas.openxmlformats.org/officeDocument/2006/relationships" xmlns:m="http://schemas.openxmlformats.org/officeDocument/2006/math" xmlns:v="urn:schemas-microsoft-com:vml" xmlns:wp14="http://schemas.microsoft.com/office/word/2010/wordprocessingDrawing" xmlns:wp="http://schemas.openxmlformats.org/drawingml/2006/wordprocessingDrawing" xmlns:w10="urn:schemas-microsoft-com:office:word" xmlns:w="http://schemas.openxmlformats.org/wordprocessingml/2006/main" xmlns:w14="http://schemas.microsoft.com/office/word/2010/wordml" xmlns:w15="http://schemas.microsoft.com/office/word/2012/wordml" xmlns:w16cex="http://schemas.microsoft.com/office/word/2018/wordml/cex" xmlns:w16cid="http://schemas.microsoft.com/office/word/2016/wordml/cid" xmlns:w16="http://schemas.microsoft.com/office/word/2018/wordml" xmlns:w16du="http://schemas.microsoft.com/office/word/2023/wordml/word16du" xmlns:w16sdtdh="http://schemas.microsoft.com/office/word/2020/wordml/sdtdatahash" xmlns:w16sdtfl="http://schemas.microsoft.com/office/word/2024/wordml/sdtformatlock" xmlns:w16se="http://schemas.microsoft.com/office/word/2015/wordml/symex" xmlns:wpg="http://schemas.microsoft.com/office/word/2010/wordprocessingGroup" xmlns:wpi="http://schemas.microsoft.com/office/word/2010/wordprocessingInk" xmlns:wne="http://schemas.microsoft.com/office/word/2006/wordml" xmlns:wps="http://schemas.microsoft.com/office/word/2010/wordprocessingShape" mc:Ignorable="w14 w15 w16se w16cid w16 w16cex w16sdtdh w16sdtfl w16du wp14">
   <w:body>
-    <w:p>
-      <w:pPr>
-        <w:pStyle w:val="Ttol"/>
-        <w:jc w:val="center"/>
-      </w:pPr>
-      <w:r>
-        <w:t xml:space="preserve">Guia per </w:t>
-      </w:r>
-      <w:r>
-        <w:t>al</w:t>
-      </w:r>
-      <w:r>
-        <w:t xml:space="preserve"> desplegament de</w:t>
-      </w:r>
-      <w:r>
-        <w:t xml:space="preserve"> </w:t>
-      </w:r>
-      <w:proofErr w:type="spellStart"/>
-      <w:r>
-        <w:t>Karma</w:t>
-      </w:r>
-      <w:r>
-        <w:t>WebApi</w:t>
-      </w:r>
-      <w:proofErr w:type="spellEnd"/>
-      <w:r>
-        <w:t xml:space="preserve"> </w:t>
-      </w:r>
-      <w:r>
-        <w:t xml:space="preserve">mitjançant </w:t>
-      </w:r>
-      <w:proofErr w:type="spellStart"/>
-      <w:r>
-        <w:t>Docker</w:t>
-      </w:r>
-      <w:proofErr w:type="spellEnd"/>
-    </w:p>
-    <w:p>
-      <w:pPr>
-        <w:rPr>
-          <w:rFonts w:ascii="Segoe UI Emoji" w:hAnsi="Segoe UI Emoji" w:cs="Segoe UI Emoji"/>
-          <w:b/>
-          <w:bCs/>
-        </w:rPr>
-      </w:pPr>
-    </w:p>
+    <w:sdt>
+      <w:sdtPr>
+        <w:id w:val="1565295896"/>
+        <w:docPartObj>
+          <w:docPartGallery w:val="Cover Pages"/>
+          <w:docPartUnique/>
+        </w:docPartObj>
+      </w:sdtPr>
+      <w:sdtContent>
+        <w:p>
+          <w:r>
+            <w:rPr>
+              <w:noProof/>
+            </w:rPr>
+            <mc:AlternateContent>
+              <mc:Choice Requires="wpg">
+                <w:drawing>
+                  <wp:anchor distT="0" distB="0" distL="114300" distR="114300" simplePos="0" relativeHeight="251662336" behindDoc="0" locked="0" layoutInCell="1" allowOverlap="1" wp14:anchorId="02743EE6" wp14:editId="409DB2C1">
+                    <wp:simplePos x="0" y="0"/>
+                    <wp:positionH relativeFrom="page">
+                      <wp:align>center</wp:align>
+                    </wp:positionH>
+                    <mc:AlternateContent>
+                      <mc:Choice Requires="wp14">
+                        <wp:positionV relativeFrom="page">
+                          <wp14:pctPosVOffset>2300</wp14:pctPosVOffset>
+                        </wp:positionV>
+                      </mc:Choice>
+                      <mc:Fallback>
+                        <wp:positionV relativeFrom="page">
+                          <wp:posOffset>245745</wp:posOffset>
+                        </wp:positionV>
+                      </mc:Fallback>
+                    </mc:AlternateContent>
+                    <wp:extent cx="7315200" cy="1215391"/>
+                    <wp:effectExtent l="0" t="0" r="1270" b="1905"/>
+                    <wp:wrapNone/>
+                    <wp:docPr id="149" name="Grupo 149"/>
+                    <wp:cNvGraphicFramePr/>
+                    <a:graphic xmlns:a="http://schemas.openxmlformats.org/drawingml/2006/main">
+                      <a:graphicData uri="http://schemas.microsoft.com/office/word/2010/wordprocessingGroup">
+                        <wpg:wgp>
+                          <wpg:cNvGrpSpPr/>
+                          <wpg:grpSpPr>
+                            <a:xfrm>
+                              <a:off x="0" y="0"/>
+                              <a:ext cx="7315200" cy="1215391"/>
+                              <a:chOff x="0" y="-1"/>
+                              <a:chExt cx="7315200" cy="1216153"/>
+                            </a:xfrm>
+                          </wpg:grpSpPr>
+                          <wps:wsp>
+                            <wps:cNvPr id="150" name="Rectángulo 51"/>
+                            <wps:cNvSpPr/>
+                            <wps:spPr>
+                              <a:xfrm>
+                                <a:off x="0" y="-1"/>
+                                <a:ext cx="7315200" cy="1130373"/>
+                              </a:xfrm>
+                              <a:custGeom>
+                                <a:avLst/>
+                                <a:gdLst>
+                                  <a:gd name="connsiteX0" fmla="*/ 0 w 7312660"/>
+                                  <a:gd name="connsiteY0" fmla="*/ 0 h 1215390"/>
+                                  <a:gd name="connsiteX1" fmla="*/ 7312660 w 7312660"/>
+                                  <a:gd name="connsiteY1" fmla="*/ 0 h 1215390"/>
+                                  <a:gd name="connsiteX2" fmla="*/ 7312660 w 7312660"/>
+                                  <a:gd name="connsiteY2" fmla="*/ 1215390 h 1215390"/>
+                                  <a:gd name="connsiteX3" fmla="*/ 0 w 7312660"/>
+                                  <a:gd name="connsiteY3" fmla="*/ 1215390 h 1215390"/>
+                                  <a:gd name="connsiteX4" fmla="*/ 0 w 7312660"/>
+                                  <a:gd name="connsiteY4" fmla="*/ 0 h 1215390"/>
+                                  <a:gd name="connsiteX0" fmla="*/ 0 w 7312660"/>
+                                  <a:gd name="connsiteY0" fmla="*/ 0 h 1215390"/>
+                                  <a:gd name="connsiteX1" fmla="*/ 7312660 w 7312660"/>
+                                  <a:gd name="connsiteY1" fmla="*/ 0 h 1215390"/>
+                                  <a:gd name="connsiteX2" fmla="*/ 7312660 w 7312660"/>
+                                  <a:gd name="connsiteY2" fmla="*/ 1215390 h 1215390"/>
+                                  <a:gd name="connsiteX3" fmla="*/ 3667125 w 7312660"/>
+                                  <a:gd name="connsiteY3" fmla="*/ 1209675 h 1215390"/>
+                                  <a:gd name="connsiteX4" fmla="*/ 0 w 7312660"/>
+                                  <a:gd name="connsiteY4" fmla="*/ 1215390 h 1215390"/>
+                                  <a:gd name="connsiteX5" fmla="*/ 0 w 7312660"/>
+                                  <a:gd name="connsiteY5" fmla="*/ 0 h 1215390"/>
+                                  <a:gd name="connsiteX0" fmla="*/ 0 w 7312660"/>
+                                  <a:gd name="connsiteY0" fmla="*/ 0 h 1215390"/>
+                                  <a:gd name="connsiteX1" fmla="*/ 7312660 w 7312660"/>
+                                  <a:gd name="connsiteY1" fmla="*/ 0 h 1215390"/>
+                                  <a:gd name="connsiteX2" fmla="*/ 7312660 w 7312660"/>
+                                  <a:gd name="connsiteY2" fmla="*/ 1215390 h 1215390"/>
+                                  <a:gd name="connsiteX3" fmla="*/ 3619500 w 7312660"/>
+                                  <a:gd name="connsiteY3" fmla="*/ 733425 h 1215390"/>
+                                  <a:gd name="connsiteX4" fmla="*/ 0 w 7312660"/>
+                                  <a:gd name="connsiteY4" fmla="*/ 1215390 h 1215390"/>
+                                  <a:gd name="connsiteX5" fmla="*/ 0 w 7312660"/>
+                                  <a:gd name="connsiteY5" fmla="*/ 0 h 1215390"/>
+                                  <a:gd name="connsiteX0" fmla="*/ 0 w 7312660"/>
+                                  <a:gd name="connsiteY0" fmla="*/ 0 h 1215390"/>
+                                  <a:gd name="connsiteX1" fmla="*/ 7312660 w 7312660"/>
+                                  <a:gd name="connsiteY1" fmla="*/ 0 h 1215390"/>
+                                  <a:gd name="connsiteX2" fmla="*/ 7312660 w 7312660"/>
+                                  <a:gd name="connsiteY2" fmla="*/ 1129665 h 1215390"/>
+                                  <a:gd name="connsiteX3" fmla="*/ 3619500 w 7312660"/>
+                                  <a:gd name="connsiteY3" fmla="*/ 733425 h 1215390"/>
+                                  <a:gd name="connsiteX4" fmla="*/ 0 w 7312660"/>
+                                  <a:gd name="connsiteY4" fmla="*/ 1215390 h 1215390"/>
+                                  <a:gd name="connsiteX5" fmla="*/ 0 w 7312660"/>
+                                  <a:gd name="connsiteY5" fmla="*/ 0 h 1215390"/>
+                                  <a:gd name="connsiteX0" fmla="*/ 9525 w 7322185"/>
+                                  <a:gd name="connsiteY0" fmla="*/ 0 h 1129665"/>
+                                  <a:gd name="connsiteX1" fmla="*/ 7322185 w 7322185"/>
+                                  <a:gd name="connsiteY1" fmla="*/ 0 h 1129665"/>
+                                  <a:gd name="connsiteX2" fmla="*/ 7322185 w 7322185"/>
+                                  <a:gd name="connsiteY2" fmla="*/ 1129665 h 1129665"/>
+                                  <a:gd name="connsiteX3" fmla="*/ 3629025 w 7322185"/>
+                                  <a:gd name="connsiteY3" fmla="*/ 733425 h 1129665"/>
+                                  <a:gd name="connsiteX4" fmla="*/ 0 w 7322185"/>
+                                  <a:gd name="connsiteY4" fmla="*/ 1091565 h 1129665"/>
+                                  <a:gd name="connsiteX5" fmla="*/ 9525 w 7322185"/>
+                                  <a:gd name="connsiteY5" fmla="*/ 0 h 1129665"/>
+                                  <a:gd name="connsiteX0" fmla="*/ 0 w 7312660"/>
+                                  <a:gd name="connsiteY0" fmla="*/ 0 h 1129665"/>
+                                  <a:gd name="connsiteX1" fmla="*/ 7312660 w 7312660"/>
+                                  <a:gd name="connsiteY1" fmla="*/ 0 h 1129665"/>
+                                  <a:gd name="connsiteX2" fmla="*/ 7312660 w 7312660"/>
+                                  <a:gd name="connsiteY2" fmla="*/ 1129665 h 1129665"/>
+                                  <a:gd name="connsiteX3" fmla="*/ 3619500 w 7312660"/>
+                                  <a:gd name="connsiteY3" fmla="*/ 733425 h 1129665"/>
+                                  <a:gd name="connsiteX4" fmla="*/ 0 w 7312660"/>
+                                  <a:gd name="connsiteY4" fmla="*/ 1091565 h 1129665"/>
+                                  <a:gd name="connsiteX5" fmla="*/ 0 w 7312660"/>
+                                  <a:gd name="connsiteY5" fmla="*/ 0 h 1129665"/>
+                                </a:gdLst>
+                                <a:ahLst/>
+                                <a:cxnLst>
+                                  <a:cxn ang="0">
+                                    <a:pos x="connsiteX0" y="connsiteY0"/>
+                                  </a:cxn>
+                                  <a:cxn ang="0">
+                                    <a:pos x="connsiteX1" y="connsiteY1"/>
+                                  </a:cxn>
+                                  <a:cxn ang="0">
+                                    <a:pos x="connsiteX2" y="connsiteY2"/>
+                                  </a:cxn>
+                                  <a:cxn ang="0">
+                                    <a:pos x="connsiteX3" y="connsiteY3"/>
+                                  </a:cxn>
+                                  <a:cxn ang="0">
+                                    <a:pos x="connsiteX4" y="connsiteY4"/>
+                                  </a:cxn>
+                                  <a:cxn ang="0">
+                                    <a:pos x="connsiteX5" y="connsiteY5"/>
+                                  </a:cxn>
+                                </a:cxnLst>
+                                <a:rect l="l" t="t" r="r" b="b"/>
+                                <a:pathLst>
+                                  <a:path w="7312660" h="1129665">
+                                    <a:moveTo>
+                                      <a:pt x="0" y="0"/>
+                                    </a:moveTo>
+                                    <a:lnTo>
+                                      <a:pt x="7312660" y="0"/>
+                                    </a:lnTo>
+                                    <a:lnTo>
+                                      <a:pt x="7312660" y="1129665"/>
+                                    </a:lnTo>
+                                    <a:lnTo>
+                                      <a:pt x="3619500" y="733425"/>
+                                    </a:lnTo>
+                                    <a:lnTo>
+                                      <a:pt x="0" y="1091565"/>
+                                    </a:lnTo>
+                                    <a:lnTo>
+                                      <a:pt x="0" y="0"/>
+                                    </a:lnTo>
+                                    <a:close/>
+                                  </a:path>
+                                </a:pathLst>
+                              </a:custGeom>
+                              <a:ln>
+                                <a:noFill/>
+                              </a:ln>
+                            </wps:spPr>
+                            <wps:style>
+                              <a:lnRef idx="2">
+                                <a:schemeClr val="accent1">
+                                  <a:shade val="50000"/>
+                                </a:schemeClr>
+                              </a:lnRef>
+                              <a:fillRef idx="1">
+                                <a:schemeClr val="accent1"/>
+                              </a:fillRef>
+                              <a:effectRef idx="0">
+                                <a:schemeClr val="accent1"/>
+                              </a:effectRef>
+                              <a:fontRef idx="minor">
+                                <a:schemeClr val="lt1"/>
+                              </a:fontRef>
+                            </wps:style>
+                            <wps:bodyPr rot="0" spcFirstLastPara="0" vertOverflow="overflow" horzOverflow="overflow" vert="horz" wrap="square" lIns="91440" tIns="45720" rIns="91440" bIns="45720" numCol="1" spcCol="0" rtlCol="0" fromWordArt="0" anchor="ctr" anchorCtr="0" forceAA="0" compatLnSpc="1">
+                              <a:prstTxWarp prst="textNoShape">
+                                <a:avLst/>
+                              </a:prstTxWarp>
+                              <a:noAutofit/>
+                            </wps:bodyPr>
+                          </wps:wsp>
+                          <wps:wsp>
+                            <wps:cNvPr id="151" name="Rectángulo 151"/>
+                            <wps:cNvSpPr/>
+                            <wps:spPr>
+                              <a:xfrm>
+                                <a:off x="0" y="0"/>
+                                <a:ext cx="7315200" cy="1216152"/>
+                              </a:xfrm>
+                              <a:prstGeom prst="rect">
+                                <a:avLst/>
+                              </a:prstGeom>
+                              <a:blipFill>
+                                <a:blip r:embed="rId8"/>
+                                <a:stretch>
+                                  <a:fillRect r="-7574"/>
+                                </a:stretch>
+                              </a:blipFill>
+                              <a:ln>
+                                <a:noFill/>
+                              </a:ln>
+                            </wps:spPr>
+                            <wps:style>
+                              <a:lnRef idx="2">
+                                <a:schemeClr val="accent1">
+                                  <a:shade val="50000"/>
+                                </a:schemeClr>
+                              </a:lnRef>
+                              <a:fillRef idx="1">
+                                <a:schemeClr val="accent1"/>
+                              </a:fillRef>
+                              <a:effectRef idx="0">
+                                <a:schemeClr val="accent1"/>
+                              </a:effectRef>
+                              <a:fontRef idx="minor">
+                                <a:schemeClr val="lt1"/>
+                              </a:fontRef>
+                            </wps:style>
+                            <wps:bodyPr rot="0" spcFirstLastPara="0" vertOverflow="overflow" horzOverflow="overflow" vert="horz" wrap="square" lIns="91440" tIns="45720" rIns="91440" bIns="45720" numCol="1" spcCol="0" rtlCol="0" fromWordArt="0" anchor="ctr" anchorCtr="0" forceAA="0" compatLnSpc="1">
+                              <a:prstTxWarp prst="textNoShape">
+                                <a:avLst/>
+                              </a:prstTxWarp>
+                              <a:noAutofit/>
+                            </wps:bodyPr>
+                          </wps:wsp>
+                        </wpg:wgp>
+                      </a:graphicData>
+                    </a:graphic>
+                    <wp14:sizeRelH relativeFrom="page">
+                      <wp14:pctWidth>94100</wp14:pctWidth>
+                    </wp14:sizeRelH>
+                    <wp14:sizeRelV relativeFrom="page">
+                      <wp14:pctHeight>12100</wp14:pctHeight>
+                    </wp14:sizeRelV>
+                  </wp:anchor>
+                </w:drawing>
+              </mc:Choice>
+              <mc:Fallback>
+                <w:pict>
+                  <v:group w14:anchorId="3A8DCEBA" id="Grupo 149" o:spid="_x0000_s1026" style="position:absolute;margin-left:0;margin-top:0;width:8in;height:95.7pt;z-index:251662336;mso-width-percent:941;mso-height-percent:121;mso-top-percent:23;mso-position-horizontal:center;mso-position-horizontal-relative:page;mso-position-vertical-relative:page;mso-width-percent:941;mso-height-percent:121;mso-top-percent:23" coordorigin="" coordsize="73152,12161" o:gfxdata="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">
+                    <v:shape id="Rectángulo 51" o:spid="_x0000_s1027" style="position:absolute;width:73152;height:11303;visibility:visible;mso-wrap-style:square;v-text-anchor:middle" coordsize="7312660,1129665" o:gfxdata="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" path="m,l7312660,r,1129665l3619500,733425,,1091565,,xe" fillcolor="#156082 [3204]" stroked="f" strokeweight="1pt">
+                      <v:stroke joinstyle="miter"/>
+                      <v:path arrowok="t" o:connecttype="custom" o:connectlocs="0,0;7315200,0;7315200,1130373;3620757,733885;0,1092249;0,0" o:connectangles="0,0,0,0,0,0"/>
+                    </v:shape>
+                    <v:rect id="Rectángulo 151" o:spid="_x0000_s1028" style="position:absolute;width:73152;height:12161;visibility:visible;mso-wrap-style:square;v-text-anchor:middle" o:gfxdata="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" stroked="f" strokeweight="1pt">
+                      <v:fill r:id="rId9" o:title="" recolor="t" rotate="t" type="frame"/>
+                    </v:rect>
+                    <w10:wrap anchorx="page" anchory="page"/>
+                  </v:group>
+                </w:pict>
+              </mc:Fallback>
+            </mc:AlternateContent>
+          </w:r>
+          <w:r>
+            <w:rPr>
+              <w:noProof/>
+            </w:rPr>
+            <mc:AlternateContent>
+              <mc:Choice Requires="wps">
+                <w:drawing>
+                  <wp:anchor distT="0" distB="0" distL="114300" distR="114300" simplePos="0" relativeHeight="251660288" behindDoc="0" locked="0" layoutInCell="1" allowOverlap="1" wp14:anchorId="7CDF6E9A" wp14:editId="22A30EA5">
+                    <wp:simplePos x="0" y="0"/>
+                    <wp:positionH relativeFrom="page">
+                      <wp:align>center</wp:align>
+                    </wp:positionH>
+                    <mc:AlternateContent>
+                      <mc:Choice Requires="wp14">
+                        <wp:positionV relativeFrom="page">
+                          <wp14:pctPosVOffset>81800</wp14:pctPosVOffset>
+                        </wp:positionV>
+                      </mc:Choice>
+                      <mc:Fallback>
+                        <wp:positionV relativeFrom="page">
+                          <wp:posOffset>8745855</wp:posOffset>
+                        </wp:positionV>
+                      </mc:Fallback>
+                    </mc:AlternateContent>
+                    <wp:extent cx="7315200" cy="914400"/>
+                    <wp:effectExtent l="0" t="0" r="0" b="8255"/>
+                    <wp:wrapSquare wrapText="bothSides"/>
+                    <wp:docPr id="152" name="Cuadro de texto 152"/>
+                    <wp:cNvGraphicFramePr/>
+                    <a:graphic xmlns:a="http://schemas.openxmlformats.org/drawingml/2006/main">
+                      <a:graphicData uri="http://schemas.microsoft.com/office/word/2010/wordprocessingShape">
+                        <wps:wsp>
+                          <wps:cNvSpPr txBox="1"/>
+                          <wps:spPr>
+                            <a:xfrm>
+                              <a:off x="0" y="0"/>
+                              <a:ext cx="7315200" cy="914400"/>
+                            </a:xfrm>
+                            <a:prstGeom prst="rect">
+                              <a:avLst/>
+                            </a:prstGeom>
+                            <a:noFill/>
+                            <a:ln w="6350">
+                              <a:noFill/>
+                            </a:ln>
+                            <a:effectLst/>
+                          </wps:spPr>
+                          <wps:style>
+                            <a:lnRef idx="0">
+                              <a:schemeClr val="accent1"/>
+                            </a:lnRef>
+                            <a:fillRef idx="0">
+                              <a:schemeClr val="accent1"/>
+                            </a:fillRef>
+                            <a:effectRef idx="0">
+                              <a:schemeClr val="accent1"/>
+                            </a:effectRef>
+                            <a:fontRef idx="minor">
+                              <a:schemeClr val="dk1"/>
+                            </a:fontRef>
+                          </wps:style>
+                          <wps:txbx>
+                            <w:txbxContent>
+                              <w:sdt>
+                                <w:sdtPr>
+                                  <w:rPr>
+                                    <w:color w:val="595959" w:themeColor="text1" w:themeTint="A6"/>
+                                    <w:sz w:val="28"/>
+                                    <w:szCs w:val="28"/>
+                                  </w:rPr>
+                                  <w:alias w:val="Autor"/>
+                                  <w:tag w:val=""/>
+                                  <w:id w:val="789243997"/>
+                                  <w:dataBinding w:prefixMappings="xmlns:ns0='http://purl.org/dc/elements/1.1/' xmlns:ns1='http://schemas.openxmlformats.org/package/2006/metadata/core-properties' " w:xpath="/ns1:coreProperties[1]/ns0:creator[1]" w:storeItemID="{6C3C8BC8-F283-45AE-878A-BAB7291924A1}"/>
+                                  <w:text/>
+                                </w:sdtPr>
+                                <w:sdtContent>
+                                  <w:p>
+                                    <w:pPr>
+                                      <w:pStyle w:val="Senseespaiat"/>
+                                      <w:jc w:val="right"/>
+                                      <w:rPr>
+                                        <w:color w:val="595959" w:themeColor="text1" w:themeTint="A6"/>
+                                        <w:sz w:val="28"/>
+                                        <w:szCs w:val="28"/>
+                                      </w:rPr>
+                                    </w:pPr>
+                                    <w:r>
+                                      <w:rPr>
+                                        <w:color w:val="595959" w:themeColor="text1" w:themeTint="A6"/>
+                                        <w:sz w:val="28"/>
+                                        <w:szCs w:val="28"/>
+                                      </w:rPr>
+                                      <w:t>Sofia Marti Rodriguez</w:t>
+                                    </w:r>
+                                  </w:p>
+                                </w:sdtContent>
+                              </w:sdt>
+                              <w:p>
+                                <w:pPr>
+                                  <w:pStyle w:val="Senseespaiat"/>
+                                  <w:jc w:val="right"/>
+                                  <w:rPr>
+                                    <w:color w:val="595959" w:themeColor="text1" w:themeTint="A6"/>
+                                    <w:sz w:val="18"/>
+                                    <w:szCs w:val="18"/>
+                                  </w:rPr>
+                                </w:pPr>
+                                <w:sdt>
+                                  <w:sdtPr>
+                                    <w:rPr>
+                                      <w:rStyle w:val="Enlla"/>
+                                      <w:rFonts w:eastAsiaTheme="minorHAnsi"/>
+                                      <w:kern w:val="2"/>
+                                      <w:sz w:val="18"/>
+                                      <w:szCs w:val="18"/>
+                                      <w14:ligatures w14:val="standardContextual"/>
+                                    </w:rPr>
+                                    <w:alias w:val="CorreoElectrónico"/>
+                                    <w:tag w:val="CorreoElectrónico"/>
+                                    <w:id w:val="942260680"/>
+                                    <w:dataBinding w:prefixMappings="xmlns:ns0='http://schemas.microsoft.com/office/2006/coverPageProps' " w:xpath="/ns0:CoverPageProperties[1]/ns0:CompanyEmail[1]" w:storeItemID="{55AF091B-3C7A-41E3-B477-F2FDAA23CFDA}"/>
+                                    <w:text/>
+                                  </w:sdtPr>
+                                  <w:sdtContent>
+                                    <w:hyperlink r:id="rId10" w:history="1">
+                                      <w:r>
+                                        <w:rPr>
+                                          <w:rStyle w:val="Enlla"/>
+                                          <w:rFonts w:eastAsiaTheme="minorHAnsi"/>
+                                          <w:kern w:val="2"/>
+                                          <w:sz w:val="18"/>
+                                          <w:szCs w:val="18"/>
+                                          <w:lang w:val="ca-ES" w:eastAsia="en-US"/>
+                                          <w14:ligatures w14:val="standardContextual"/>
+                                        </w:rPr>
+                                        <w:t>somarrod@alumni.upv.es</w:t>
+                                      </w:r>
+                                    </w:hyperlink>
+                                  </w:sdtContent>
+                                </w:sdt>
+                              </w:p>
+                            </w:txbxContent>
+                          </wps:txbx>
+                          <wps:bodyPr rot="0" spcFirstLastPara="0" vertOverflow="overflow" horzOverflow="overflow" vert="horz" wrap="square" lIns="1600200" tIns="0" rIns="685800" bIns="0" numCol="1" spcCol="0" rtlCol="0" fromWordArt="0" anchor="b" anchorCtr="0" forceAA="0" compatLnSpc="1">
+                            <a:prstTxWarp prst="textNoShape">
+                              <a:avLst/>
+                            </a:prstTxWarp>
+                            <a:noAutofit/>
+                          </wps:bodyPr>
+                        </wps:wsp>
+                      </a:graphicData>
+                    </a:graphic>
+                    <wp14:sizeRelH relativeFrom="page">
+                      <wp14:pctWidth>94100</wp14:pctWidth>
+                    </wp14:sizeRelH>
+                    <wp14:sizeRelV relativeFrom="page">
+                      <wp14:pctHeight>9200</wp14:pctHeight>
+                    </wp14:sizeRelV>
+                  </wp:anchor>
+                </w:drawing>
+              </mc:Choice>
+              <mc:Fallback>
+                <w:pict>
+                  <v:shapetype w14:anchorId="7CDF6E9A" id="_x0000_t202" coordsize="21600,21600" o:spt="202" path="m,l,21600r21600,l21600,xe">
+                    <v:stroke joinstyle="miter"/>
+                    <v:path gradientshapeok="t" o:connecttype="rect"/>
+                  </v:shapetype>
+                  <v:shape id="Cuadro de texto 152" o:spid="_x0000_s1026" type="#_x0000_t202" style="position:absolute;margin-left:0;margin-top:0;width:8in;height:1in;z-index:251660288;visibility:visible;mso-wrap-style:square;mso-width-percent:941;mso-height-percent:92;mso-top-percent:818;mso-wrap-distance-left:9pt;mso-wrap-distance-top:0;mso-wrap-distance-right:9pt;mso-wrap-distance-bottom:0;mso-position-horizontal:center;mso-position-horizontal-relative:page;mso-position-vertical-relative:page;mso-width-percent:941;mso-height-percent:92;mso-top-percent:818;mso-width-relative:page;mso-height-relative:page;v-text-anchor:bottom" o:gfxdata="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" filled="f" stroked="f" strokeweight=".5pt">
+                    <v:textbox inset="126pt,0,54pt,0">
+                      <w:txbxContent>
+                        <w:sdt>
+                          <w:sdtPr>
+                            <w:rPr>
+                              <w:color w:val="595959" w:themeColor="text1" w:themeTint="A6"/>
+                              <w:sz w:val="28"/>
+                              <w:szCs w:val="28"/>
+                            </w:rPr>
+                            <w:alias w:val="Autor"/>
+                            <w:tag w:val=""/>
+                            <w:id w:val="789243997"/>
+                            <w:dataBinding w:prefixMappings="xmlns:ns0='http://purl.org/dc/elements/1.1/' xmlns:ns1='http://schemas.openxmlformats.org/package/2006/metadata/core-properties' " w:xpath="/ns1:coreProperties[1]/ns0:creator[1]" w:storeItemID="{6C3C8BC8-F283-45AE-878A-BAB7291924A1}"/>
+                            <w:text/>
+                          </w:sdtPr>
+                          <w:sdtContent>
+                            <w:p>
+                              <w:pPr>
+                                <w:pStyle w:val="Senseespaiat"/>
+                                <w:jc w:val="right"/>
+                                <w:rPr>
+                                  <w:color w:val="595959" w:themeColor="text1" w:themeTint="A6"/>
+                                  <w:sz w:val="28"/>
+                                  <w:szCs w:val="28"/>
+                                </w:rPr>
+                              </w:pPr>
+                              <w:r>
+                                <w:rPr>
+                                  <w:color w:val="595959" w:themeColor="text1" w:themeTint="A6"/>
+                                  <w:sz w:val="28"/>
+                                  <w:szCs w:val="28"/>
+                                </w:rPr>
+                                <w:t>Sofia Marti Rodriguez</w:t>
+                              </w:r>
+                            </w:p>
+                          </w:sdtContent>
+                        </w:sdt>
+                        <w:p>
+                          <w:pPr>
+                            <w:pStyle w:val="Senseespaiat"/>
+                            <w:jc w:val="right"/>
+                            <w:rPr>
+                              <w:color w:val="595959" w:themeColor="text1" w:themeTint="A6"/>
+                              <w:sz w:val="18"/>
+                              <w:szCs w:val="18"/>
+                            </w:rPr>
+                          </w:pPr>
+                          <w:sdt>
+                            <w:sdtPr>
+                              <w:rPr>
+                                <w:rStyle w:val="Enlla"/>
+                                <w:rFonts w:eastAsiaTheme="minorHAnsi"/>
+                                <w:kern w:val="2"/>
+                                <w:sz w:val="18"/>
+                                <w:szCs w:val="18"/>
+                                <w14:ligatures w14:val="standardContextual"/>
+                              </w:rPr>
+                              <w:alias w:val="CorreoElectrónico"/>
+                              <w:tag w:val="CorreoElectrónico"/>
+                              <w:id w:val="942260680"/>
+                              <w:dataBinding w:prefixMappings="xmlns:ns0='http://schemas.microsoft.com/office/2006/coverPageProps' " w:xpath="/ns0:CoverPageProperties[1]/ns0:CompanyEmail[1]" w:storeItemID="{55AF091B-3C7A-41E3-B477-F2FDAA23CFDA}"/>
+                              <w:text/>
+                            </w:sdtPr>
+                            <w:sdtContent>
+                              <w:hyperlink r:id="rId11" w:history="1">
+                                <w:r>
+                                  <w:rPr>
+                                    <w:rStyle w:val="Enlla"/>
+                                    <w:rFonts w:eastAsiaTheme="minorHAnsi"/>
+                                    <w:kern w:val="2"/>
+                                    <w:sz w:val="18"/>
+                                    <w:szCs w:val="18"/>
+                                    <w:lang w:val="ca-ES" w:eastAsia="en-US"/>
+                                    <w14:ligatures w14:val="standardContextual"/>
+                                  </w:rPr>
+                                  <w:t>somarrod@alumni.upv.es</w:t>
+                                </w:r>
+                              </w:hyperlink>
+                            </w:sdtContent>
+                          </w:sdt>
+                        </w:p>
+                      </w:txbxContent>
+                    </v:textbox>
+                    <w10:wrap type="square" anchorx="page" anchory="page"/>
+                  </v:shape>
+                </w:pict>
+              </mc:Fallback>
+            </mc:AlternateContent>
+          </w:r>
+          <w:r>
+            <w:rPr>
+              <w:noProof/>
+            </w:rPr>
+            <mc:AlternateContent>
+              <mc:Choice Requires="wps">
+                <w:drawing>
+                  <wp:anchor distT="0" distB="0" distL="114300" distR="114300" simplePos="0" relativeHeight="251661312" behindDoc="0" locked="0" layoutInCell="1" allowOverlap="1" wp14:anchorId="64759DCA" wp14:editId="0F334406">
+                    <wp:simplePos x="0" y="0"/>
+                    <wp:positionH relativeFrom="page">
+                      <wp:align>center</wp:align>
+                    </wp:positionH>
+                    <mc:AlternateContent>
+                      <mc:Choice Requires="wp14">
+                        <wp:positionV relativeFrom="page">
+                          <wp14:pctPosVOffset>70000</wp14:pctPosVOffset>
+                        </wp:positionV>
+                      </mc:Choice>
+                      <mc:Fallback>
+                        <wp:positionV relativeFrom="page">
+                          <wp:posOffset>7484110</wp:posOffset>
+                        </wp:positionV>
+                      </mc:Fallback>
+                    </mc:AlternateContent>
+                    <wp:extent cx="7315200" cy="1009650"/>
+                    <wp:effectExtent l="0" t="0" r="0" b="0"/>
+                    <wp:wrapSquare wrapText="bothSides"/>
+                    <wp:docPr id="153" name="Cuadro de texto 153"/>
+                    <wp:cNvGraphicFramePr/>
+                    <a:graphic xmlns:a="http://schemas.openxmlformats.org/drawingml/2006/main">
+                      <a:graphicData uri="http://schemas.microsoft.com/office/word/2010/wordprocessingShape">
+                        <wps:wsp>
+                          <wps:cNvSpPr txBox="1"/>
+                          <wps:spPr>
+                            <a:xfrm>
+                              <a:off x="0" y="0"/>
+                              <a:ext cx="7315200" cy="1009650"/>
+                            </a:xfrm>
+                            <a:prstGeom prst="rect">
+                              <a:avLst/>
+                            </a:prstGeom>
+                            <a:noFill/>
+                            <a:ln w="6350">
+                              <a:noFill/>
+                            </a:ln>
+                            <a:effectLst/>
+                          </wps:spPr>
+                          <wps:style>
+                            <a:lnRef idx="0">
+                              <a:schemeClr val="accent1"/>
+                            </a:lnRef>
+                            <a:fillRef idx="0">
+                              <a:schemeClr val="accent1"/>
+                            </a:fillRef>
+                            <a:effectRef idx="0">
+                              <a:schemeClr val="accent1"/>
+                            </a:effectRef>
+                            <a:fontRef idx="minor">
+                              <a:schemeClr val="dk1"/>
+                            </a:fontRef>
+                          </wps:style>
+                          <wps:txbx>
+                            <w:txbxContent>
+                              <w:p>
+                                <w:pPr>
+                                  <w:pStyle w:val="Senseespaiat"/>
+                                  <w:jc w:val="right"/>
+                                  <w:rPr>
+                                    <w:color w:val="156082" w:themeColor="accent1"/>
+                                    <w:sz w:val="28"/>
+                                    <w:szCs w:val="28"/>
+                                  </w:rPr>
+                                </w:pPr>
+                                <w:proofErr w:type="spellStart"/>
+                                <w:r>
+                                  <w:rPr>
+                                    <w:color w:val="156082" w:themeColor="accent1"/>
+                                    <w:sz w:val="28"/>
+                                    <w:szCs w:val="28"/>
+                                  </w:rPr>
+                                  <w:t>Descripció</w:t>
+                                </w:r>
+                                <w:proofErr w:type="spellEnd"/>
+                              </w:p>
+                              <w:sdt>
+                                <w:sdtPr>
+                                  <w:rPr>
+                                    <w:color w:val="595959" w:themeColor="text1" w:themeTint="A6"/>
+                                    <w:sz w:val="20"/>
+                                    <w:szCs w:val="20"/>
+                                  </w:rPr>
+                                  <w:alias w:val="Descripción breve"/>
+                                  <w:tag w:val=""/>
+                                  <w:id w:val="1375273687"/>
+                                  <w:dataBinding w:prefixMappings="xmlns:ns0='http://schemas.microsoft.com/office/2006/coverPageProps' " w:xpath="/ns0:CoverPageProperties[1]/ns0:Abstract[1]" w:storeItemID="{55AF091B-3C7A-41E3-B477-F2FDAA23CFDA}"/>
+                                  <w:text w:multiLine="1"/>
+                                </w:sdtPr>
+                                <w:sdtContent>
+                                  <w:p>
+                                    <w:pPr>
+                                      <w:pStyle w:val="Senseespaiat"/>
+                                      <w:jc w:val="right"/>
+                                      <w:rPr>
+                                        <w:color w:val="595959" w:themeColor="text1" w:themeTint="A6"/>
+                                        <w:sz w:val="20"/>
+                                        <w:szCs w:val="20"/>
+                                      </w:rPr>
+                                    </w:pPr>
+                                    <w:r>
+                                      <w:rPr>
+                                        <w:color w:val="595959" w:themeColor="text1" w:themeTint="A6"/>
+                                        <w:sz w:val="20"/>
+                                        <w:szCs w:val="20"/>
+                                      </w:rPr>
+                                      <w:t xml:space="preserve">Guia orientada al </w:t>
+                                    </w:r>
+                                    <w:r>
+                                      <w:rPr>
+                                        <w:color w:val="595959" w:themeColor="text1" w:themeTint="A6"/>
+                                        <w:sz w:val="20"/>
+                                        <w:szCs w:val="20"/>
+                                      </w:rPr>
+                                      <w:t xml:space="preserve">docente </w:t>
+                                    </w:r>
+                                    <w:r>
+                                      <w:rPr>
+                                        <w:color w:val="595959" w:themeColor="text1" w:themeTint="A6"/>
+                                        <w:sz w:val="20"/>
+                                        <w:szCs w:val="20"/>
+                                      </w:rPr>
+                                      <w:t xml:space="preserve">per a desplegar </w:t>
+                                    </w:r>
+                                    <w:proofErr w:type="spellStart"/>
+                                    <w:r>
+                                      <w:rPr>
+                                        <w:color w:val="595959" w:themeColor="text1" w:themeTint="A6"/>
+                                        <w:sz w:val="20"/>
+                                        <w:szCs w:val="20"/>
+                                      </w:rPr>
+                                      <w:t>KarmaWebApi</w:t>
+                                    </w:r>
+                                    <w:proofErr w:type="spellEnd"/>
+                                    <w:r>
+                                      <w:rPr>
+                                        <w:color w:val="595959" w:themeColor="text1" w:themeTint="A6"/>
+                                        <w:sz w:val="20"/>
+                                        <w:szCs w:val="20"/>
+                                      </w:rPr>
+                                      <w:t xml:space="preserve"> </w:t>
+                                    </w:r>
+                                    <w:proofErr w:type="spellStart"/>
+                                    <w:r>
+                                      <w:rPr>
+                                        <w:color w:val="595959" w:themeColor="text1" w:themeTint="A6"/>
+                                        <w:sz w:val="20"/>
+                                        <w:szCs w:val="20"/>
+                                      </w:rPr>
+                                      <w:t>mitjançant</w:t>
+                                    </w:r>
+                                    <w:proofErr w:type="spellEnd"/>
+                                    <w:r>
+                                      <w:rPr>
+                                        <w:color w:val="595959" w:themeColor="text1" w:themeTint="A6"/>
+                                        <w:sz w:val="20"/>
+                                        <w:szCs w:val="20"/>
+                                      </w:rPr>
+                                      <w:t xml:space="preserve"> Docker</w:t>
+                                    </w:r>
+                                  </w:p>
+                                </w:sdtContent>
+                              </w:sdt>
+                            </w:txbxContent>
+                          </wps:txbx>
+                          <wps:bodyPr rot="0" spcFirstLastPara="0" vertOverflow="overflow" horzOverflow="overflow" vert="horz" wrap="square" lIns="1600200" tIns="0" rIns="685800" bIns="0" numCol="1" spcCol="0" rtlCol="0" fromWordArt="0" anchor="t" anchorCtr="0" forceAA="0" compatLnSpc="1">
+                            <a:prstTxWarp prst="textNoShape">
+                              <a:avLst/>
+                            </a:prstTxWarp>
+                            <a:spAutoFit/>
+                          </wps:bodyPr>
+                        </wps:wsp>
+                      </a:graphicData>
+                    </a:graphic>
+                    <wp14:sizeRelH relativeFrom="page">
+                      <wp14:pctWidth>94100</wp14:pctWidth>
+                    </wp14:sizeRelH>
+                    <wp14:sizeRelV relativeFrom="page">
+                      <wp14:pctHeight>10000</wp14:pctHeight>
+                    </wp14:sizeRelV>
+                  </wp:anchor>
+                </w:drawing>
+              </mc:Choice>
+              <mc:Fallback>
+                <w:pict>
+                  <v:shape w14:anchorId="64759DCA" id="Cuadro de texto 153" o:spid="_x0000_s1027" type="#_x0000_t202" style="position:absolute;margin-left:0;margin-top:0;width:8in;height:79.5pt;z-index:251661312;visibility:visible;mso-wrap-style:square;mso-width-percent:941;mso-height-percent:100;mso-top-percent:700;mso-wrap-distance-left:9pt;mso-wrap-distance-top:0;mso-wrap-distance-right:9pt;mso-wrap-distance-bottom:0;mso-position-horizontal:center;mso-position-horizontal-relative:page;mso-position-vertical-relative:page;mso-width-percent:941;mso-height-percent:100;mso-top-percent:700;mso-width-relative:page;mso-height-relative:page;v-text-anchor:top" o:gfxdata="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" filled="f" stroked="f" strokeweight=".5pt">
+                    <v:textbox style="mso-fit-shape-to-text:t" inset="126pt,0,54pt,0">
+                      <w:txbxContent>
+                        <w:p>
+                          <w:pPr>
+                            <w:pStyle w:val="Senseespaiat"/>
+                            <w:jc w:val="right"/>
+                            <w:rPr>
+                              <w:color w:val="156082" w:themeColor="accent1"/>
+                              <w:sz w:val="28"/>
+                              <w:szCs w:val="28"/>
+                            </w:rPr>
+                          </w:pPr>
+                          <w:proofErr w:type="spellStart"/>
+                          <w:r>
+                            <w:rPr>
+                              <w:color w:val="156082" w:themeColor="accent1"/>
+                              <w:sz w:val="28"/>
+                              <w:szCs w:val="28"/>
+                            </w:rPr>
+                            <w:t>Descripció</w:t>
+                          </w:r>
+                          <w:proofErr w:type="spellEnd"/>
+                        </w:p>
+                        <w:sdt>
+                          <w:sdtPr>
+                            <w:rPr>
+                              <w:color w:val="595959" w:themeColor="text1" w:themeTint="A6"/>
+                              <w:sz w:val="20"/>
+                              <w:szCs w:val="20"/>
+                            </w:rPr>
+                            <w:alias w:val="Descripción breve"/>
+                            <w:tag w:val=""/>
+                            <w:id w:val="1375273687"/>
+                            <w:dataBinding w:prefixMappings="xmlns:ns0='http://schemas.microsoft.com/office/2006/coverPageProps' " w:xpath="/ns0:CoverPageProperties[1]/ns0:Abstract[1]" w:storeItemID="{55AF091B-3C7A-41E3-B477-F2FDAA23CFDA}"/>
+                            <w:text w:multiLine="1"/>
+                          </w:sdtPr>
+                          <w:sdtContent>
+                            <w:p>
+                              <w:pPr>
+                                <w:pStyle w:val="Senseespaiat"/>
+                                <w:jc w:val="right"/>
+                                <w:rPr>
+                                  <w:color w:val="595959" w:themeColor="text1" w:themeTint="A6"/>
+                                  <w:sz w:val="20"/>
+                                  <w:szCs w:val="20"/>
+                                </w:rPr>
+                              </w:pPr>
+                              <w:r>
+                                <w:rPr>
+                                  <w:color w:val="595959" w:themeColor="text1" w:themeTint="A6"/>
+                                  <w:sz w:val="20"/>
+                                  <w:szCs w:val="20"/>
+                                </w:rPr>
+                                <w:t xml:space="preserve">Guia orientada al </w:t>
+                              </w:r>
+                              <w:r>
+                                <w:rPr>
+                                  <w:color w:val="595959" w:themeColor="text1" w:themeTint="A6"/>
+                                  <w:sz w:val="20"/>
+                                  <w:szCs w:val="20"/>
+                                </w:rPr>
+                                <w:t xml:space="preserve">docente </w:t>
+                              </w:r>
+                              <w:r>
+                                <w:rPr>
+                                  <w:color w:val="595959" w:themeColor="text1" w:themeTint="A6"/>
+                                  <w:sz w:val="20"/>
+                                  <w:szCs w:val="20"/>
+                                </w:rPr>
+                                <w:t xml:space="preserve">per a desplegar </w:t>
+                              </w:r>
+                              <w:proofErr w:type="spellStart"/>
+                              <w:r>
+                                <w:rPr>
+                                  <w:color w:val="595959" w:themeColor="text1" w:themeTint="A6"/>
+                                  <w:sz w:val="20"/>
+                                  <w:szCs w:val="20"/>
+                                </w:rPr>
+                                <w:t>KarmaWebApi</w:t>
+                              </w:r>
+                              <w:proofErr w:type="spellEnd"/>
+                              <w:r>
+                                <w:rPr>
+                                  <w:color w:val="595959" w:themeColor="text1" w:themeTint="A6"/>
+                                  <w:sz w:val="20"/>
+                                  <w:szCs w:val="20"/>
+                                </w:rPr>
+                                <w:t xml:space="preserve"> </w:t>
+                              </w:r>
+                              <w:proofErr w:type="spellStart"/>
+                              <w:r>
+                                <w:rPr>
+                                  <w:color w:val="595959" w:themeColor="text1" w:themeTint="A6"/>
+                                  <w:sz w:val="20"/>
+                                  <w:szCs w:val="20"/>
+                                </w:rPr>
+                                <w:t>mitjançant</w:t>
+                              </w:r>
+                              <w:proofErr w:type="spellEnd"/>
+                              <w:r>
+                                <w:rPr>
+                                  <w:color w:val="595959" w:themeColor="text1" w:themeTint="A6"/>
+                                  <w:sz w:val="20"/>
+                                  <w:szCs w:val="20"/>
+                                </w:rPr>
+                                <w:t xml:space="preserve"> Docker</w:t>
+                              </w:r>
+                            </w:p>
+                          </w:sdtContent>
+                        </w:sdt>
+                      </w:txbxContent>
+                    </v:textbox>
+                    <w10:wrap type="square" anchorx="page" anchory="page"/>
+                  </v:shape>
+                </w:pict>
+              </mc:Fallback>
+            </mc:AlternateContent>
+          </w:r>
+          <w:r>
+            <w:rPr>
+              <w:noProof/>
+            </w:rPr>
+            <mc:AlternateContent>
+              <mc:Choice Requires="wps">
+                <w:drawing>
+                  <wp:anchor distT="0" distB="0" distL="114300" distR="114300" simplePos="0" relativeHeight="251659264" behindDoc="0" locked="0" layoutInCell="1" allowOverlap="1" wp14:anchorId="3CC55466" wp14:editId="7943AC10">
+                    <wp:simplePos x="0" y="0"/>
+                    <wp:positionH relativeFrom="page">
+                      <wp:align>center</wp:align>
+                    </wp:positionH>
+                    <mc:AlternateContent>
+                      <mc:Choice Requires="wp14">
+                        <wp:positionV relativeFrom="page">
+                          <wp14:pctPosVOffset>30000</wp14:pctPosVOffset>
+                        </wp:positionV>
+                      </mc:Choice>
+                      <mc:Fallback>
+                        <wp:positionV relativeFrom="page">
+                          <wp:posOffset>3207385</wp:posOffset>
+                        </wp:positionV>
+                      </mc:Fallback>
+                    </mc:AlternateContent>
+                    <wp:extent cx="7315200" cy="3638550"/>
+                    <wp:effectExtent l="0" t="0" r="0" b="6350"/>
+                    <wp:wrapSquare wrapText="bothSides"/>
+                    <wp:docPr id="154" name="Cuadro de texto 154"/>
+                    <wp:cNvGraphicFramePr/>
+                    <a:graphic xmlns:a="http://schemas.openxmlformats.org/drawingml/2006/main">
+                      <a:graphicData uri="http://schemas.microsoft.com/office/word/2010/wordprocessingShape">
+                        <wps:wsp>
+                          <wps:cNvSpPr txBox="1"/>
+                          <wps:spPr>
+                            <a:xfrm>
+                              <a:off x="0" y="0"/>
+                              <a:ext cx="7315200" cy="3638550"/>
+                            </a:xfrm>
+                            <a:prstGeom prst="rect">
+                              <a:avLst/>
+                            </a:prstGeom>
+                            <a:noFill/>
+                            <a:ln w="6350">
+                              <a:noFill/>
+                            </a:ln>
+                            <a:effectLst/>
+                          </wps:spPr>
+                          <wps:style>
+                            <a:lnRef idx="0">
+                              <a:schemeClr val="accent1"/>
+                            </a:lnRef>
+                            <a:fillRef idx="0">
+                              <a:schemeClr val="accent1"/>
+                            </a:fillRef>
+                            <a:effectRef idx="0">
+                              <a:schemeClr val="accent1"/>
+                            </a:effectRef>
+                            <a:fontRef idx="minor">
+                              <a:schemeClr val="dk1"/>
+                            </a:fontRef>
+                          </wps:style>
+                          <wps:txbx>
+                            <w:txbxContent>
+                              <w:p>
+                                <w:pPr>
+                                  <w:jc w:val="right"/>
+                                  <w:rPr>
+                                    <w:color w:val="156082" w:themeColor="accent1"/>
+                                    <w:sz w:val="64"/>
+                                    <w:szCs w:val="64"/>
+                                  </w:rPr>
+                                </w:pPr>
+                                <w:sdt>
+                                  <w:sdtPr>
+                                    <w:rPr>
+                                      <w:caps/>
+                                      <w:color w:val="156082" w:themeColor="accent1"/>
+                                      <w:sz w:val="64"/>
+                                      <w:szCs w:val="64"/>
+                                    </w:rPr>
+                                    <w:alias w:val="Título"/>
+                                    <w:tag w:val=""/>
+                                    <w:id w:val="630141079"/>
+                                    <w:dataBinding w:prefixMappings="xmlns:ns0='http://purl.org/dc/elements/1.1/' xmlns:ns1='http://schemas.openxmlformats.org/package/2006/metadata/core-properties' " w:xpath="/ns1:coreProperties[1]/ns0:title[1]" w:storeItemID="{6C3C8BC8-F283-45AE-878A-BAB7291924A1}"/>
+                                    <w:text w:multiLine="1"/>
+                                  </w:sdtPr>
+                                  <w:sdtContent>
+                                    <w:r>
+                                      <w:rPr>
+                                        <w:caps/>
+                                        <w:color w:val="156082" w:themeColor="accent1"/>
+                                        <w:sz w:val="64"/>
+                                        <w:szCs w:val="64"/>
+                                      </w:rPr>
+                                      <w:t>Guia per al desplegament de KarmaWebApi mitjançant Docker</w:t>
+                                    </w:r>
+                                  </w:sdtContent>
+                                </w:sdt>
+                              </w:p>
+                              <w:sdt>
+                                <w:sdtPr>
+                                  <w:rPr>
+                                    <w:rFonts w:ascii="Cambria" w:hAnsi="Cambria"/>
+                                    <w:color w:val="404040" w:themeColor="text1" w:themeTint="BF"/>
+                                    <w:sz w:val="36"/>
+                                    <w:szCs w:val="36"/>
+                                    <w:lang w:val="es-ES"/>
+                                  </w:rPr>
+                                  <w:alias w:val="Subtítulo"/>
+                                  <w:tag w:val=""/>
+                                  <w:id w:val="1759551507"/>
+                                  <w:dataBinding w:prefixMappings="xmlns:ns0='http://purl.org/dc/elements/1.1/' xmlns:ns1='http://schemas.openxmlformats.org/package/2006/metadata/core-properties' " w:xpath="/ns1:coreProperties[1]/ns0:subject[1]" w:storeItemID="{6C3C8BC8-F283-45AE-878A-BAB7291924A1}"/>
+                                  <w:text/>
+                                </w:sdtPr>
+                                <w:sdtContent>
+                                  <w:p>
+                                    <w:pPr>
+                                      <w:jc w:val="right"/>
+                                      <w:rPr>
+                                        <w:smallCaps/>
+                                        <w:color w:val="404040" w:themeColor="text1" w:themeTint="BF"/>
+                                        <w:sz w:val="36"/>
+                                        <w:szCs w:val="36"/>
+                                      </w:rPr>
+                                    </w:pPr>
+                                    <w:proofErr w:type="spellStart"/>
+                                    <w:r>
+                                      <w:rPr>
+                                        <w:rFonts w:ascii="Cambria" w:hAnsi="Cambria"/>
+                                        <w:color w:val="404040" w:themeColor="text1" w:themeTint="BF"/>
+                                        <w:sz w:val="36"/>
+                                        <w:szCs w:val="36"/>
+                                        <w:lang w:val="es-ES"/>
+                                      </w:rPr>
+                                      <w:t>KarmaCli</w:t>
+                                    </w:r>
+                                    <w:proofErr w:type="spellEnd"/>
+                                    <w:r>
+                                      <w:rPr>
+                                        <w:rFonts w:ascii="Cambria" w:hAnsi="Cambria"/>
+                                        <w:color w:val="404040" w:themeColor="text1" w:themeTint="BF"/>
+                                        <w:sz w:val="36"/>
+                                        <w:szCs w:val="36"/>
+                                        <w:lang w:val="es-ES"/>
+                                      </w:rPr>
+                                      <w:t xml:space="preserve"> – Quin Karma tinc hui?</w:t>
+                                    </w:r>
+                                  </w:p>
+                                </w:sdtContent>
+                              </w:sdt>
+                            </w:txbxContent>
+                          </wps:txbx>
+                          <wps:bodyPr rot="0" spcFirstLastPara="0" vertOverflow="overflow" horzOverflow="overflow" vert="horz" wrap="square" lIns="1600200" tIns="0" rIns="685800" bIns="0" numCol="1" spcCol="0" rtlCol="0" fromWordArt="0" anchor="b" anchorCtr="0" forceAA="0" compatLnSpc="1">
+                            <a:prstTxWarp prst="textNoShape">
+                              <a:avLst/>
+                            </a:prstTxWarp>
+                            <a:noAutofit/>
+                          </wps:bodyPr>
+                        </wps:wsp>
+                      </a:graphicData>
+                    </a:graphic>
+                    <wp14:sizeRelH relativeFrom="page">
+                      <wp14:pctWidth>94100</wp14:pctWidth>
+                    </wp14:sizeRelH>
+                    <wp14:sizeRelV relativeFrom="page">
+                      <wp14:pctHeight>36300</wp14:pctHeight>
+                    </wp14:sizeRelV>
+                  </wp:anchor>
+                </w:drawing>
+              </mc:Choice>
+              <mc:Fallback>
+                <w:pict>
+                  <v:shape w14:anchorId="3CC55466" id="Cuadro de texto 154" o:spid="_x0000_s1028" type="#_x0000_t202" style="position:absolute;margin-left:0;margin-top:0;width:8in;height:286.5pt;z-index:251659264;visibility:visible;mso-wrap-style:square;mso-width-percent:941;mso-height-percent:363;mso-top-percent:300;mso-wrap-distance-left:9pt;mso-wrap-distance-top:0;mso-wrap-distance-right:9pt;mso-wrap-distance-bottom:0;mso-position-horizontal:center;mso-position-horizontal-relative:page;mso-position-vertical-relative:page;mso-width-percent:941;mso-height-percent:363;mso-top-percent:300;mso-width-relative:page;mso-height-relative:page;v-text-anchor:bottom" o:gfxdata="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" filled="f" stroked="f" strokeweight=".5pt">
+                    <v:textbox inset="126pt,0,54pt,0">
+                      <w:txbxContent>
+                        <w:p>
+                          <w:pPr>
+                            <w:jc w:val="right"/>
+                            <w:rPr>
+                              <w:color w:val="156082" w:themeColor="accent1"/>
+                              <w:sz w:val="64"/>
+                              <w:szCs w:val="64"/>
+                            </w:rPr>
+                          </w:pPr>
+                          <w:sdt>
+                            <w:sdtPr>
+                              <w:rPr>
+                                <w:caps/>
+                                <w:color w:val="156082" w:themeColor="accent1"/>
+                                <w:sz w:val="64"/>
+                                <w:szCs w:val="64"/>
+                              </w:rPr>
+                              <w:alias w:val="Título"/>
+                              <w:tag w:val=""/>
+                              <w:id w:val="630141079"/>
+                              <w:dataBinding w:prefixMappings="xmlns:ns0='http://purl.org/dc/elements/1.1/' xmlns:ns1='http://schemas.openxmlformats.org/package/2006/metadata/core-properties' " w:xpath="/ns1:coreProperties[1]/ns0:title[1]" w:storeItemID="{6C3C8BC8-F283-45AE-878A-BAB7291924A1}"/>
+                              <w:text w:multiLine="1"/>
+                            </w:sdtPr>
+                            <w:sdtContent>
+                              <w:r>
+                                <w:rPr>
+                                  <w:caps/>
+                                  <w:color w:val="156082" w:themeColor="accent1"/>
+                                  <w:sz w:val="64"/>
+                                  <w:szCs w:val="64"/>
+                                </w:rPr>
+                                <w:t>Guia per al desplegament de KarmaWebApi mitjançant Docker</w:t>
+                              </w:r>
+                            </w:sdtContent>
+                          </w:sdt>
+                        </w:p>
+                        <w:sdt>
+                          <w:sdtPr>
+                            <w:rPr>
+                              <w:rFonts w:ascii="Cambria" w:hAnsi="Cambria"/>
+                              <w:color w:val="404040" w:themeColor="text1" w:themeTint="BF"/>
+                              <w:sz w:val="36"/>
+                              <w:szCs w:val="36"/>
+                              <w:lang w:val="es-ES"/>
+                            </w:rPr>
+                            <w:alias w:val="Subtítulo"/>
+                            <w:tag w:val=""/>
+                            <w:id w:val="1759551507"/>
+                            <w:dataBinding w:prefixMappings="xmlns:ns0='http://purl.org/dc/elements/1.1/' xmlns:ns1='http://schemas.openxmlformats.org/package/2006/metadata/core-properties' " w:xpath="/ns1:coreProperties[1]/ns0:subject[1]" w:storeItemID="{6C3C8BC8-F283-45AE-878A-BAB7291924A1}"/>
+                            <w:text/>
+                          </w:sdtPr>
+                          <w:sdtContent>
+                            <w:p>
+                              <w:pPr>
+                                <w:jc w:val="right"/>
+                                <w:rPr>
+                                  <w:smallCaps/>
+                                  <w:color w:val="404040" w:themeColor="text1" w:themeTint="BF"/>
+                                  <w:sz w:val="36"/>
+                                  <w:szCs w:val="36"/>
+                                </w:rPr>
+                              </w:pPr>
+                              <w:proofErr w:type="spellStart"/>
+                              <w:r>
+                                <w:rPr>
+                                  <w:rFonts w:ascii="Cambria" w:hAnsi="Cambria"/>
+                                  <w:color w:val="404040" w:themeColor="text1" w:themeTint="BF"/>
+                                  <w:sz w:val="36"/>
+                                  <w:szCs w:val="36"/>
+                                  <w:lang w:val="es-ES"/>
+                                </w:rPr>
+                                <w:t>KarmaCli</w:t>
+                              </w:r>
+                              <w:proofErr w:type="spellEnd"/>
+                              <w:r>
+                                <w:rPr>
+                                  <w:rFonts w:ascii="Cambria" w:hAnsi="Cambria"/>
+                                  <w:color w:val="404040" w:themeColor="text1" w:themeTint="BF"/>
+                                  <w:sz w:val="36"/>
+                                  <w:szCs w:val="36"/>
+                                  <w:lang w:val="es-ES"/>
+                                </w:rPr>
+                                <w:t xml:space="preserve"> – Quin Karma tinc hui?</w:t>
+                              </w:r>
+                            </w:p>
+                          </w:sdtContent>
+                        </w:sdt>
+                      </w:txbxContent>
+                    </v:textbox>
+                    <w10:wrap type="square" anchorx="page" anchory="page"/>
+                  </v:shape>
+                </w:pict>
+              </mc:Fallback>
+            </mc:AlternateContent>
+          </w:r>
+        </w:p>
+        <w:p>
+          <w:pPr>
+            <w:rPr>
+              <w:rFonts w:asciiTheme="majorHAnsi" w:eastAsiaTheme="majorEastAsia" w:hAnsiTheme="majorHAnsi" w:cstheme="majorBidi"/>
+              <w:spacing w:val="-10"/>
+              <w:kern w:val="28"/>
+              <w:sz w:val="56"/>
+              <w:szCs w:val="56"/>
+            </w:rPr>
+          </w:pPr>
+          <w:r>
+            <w:br w:type="page"/>
+          </w:r>
+        </w:p>
+      </w:sdtContent>
+    </w:sdt>
     <w:sdt>
       <w:sdtPr>
         <w:rPr>
@@ -80,6 +1169,9 @@
           <w:r>
             <w:t>Contingut</w:t>
           </w:r>
+          <w:r>
+            <w:t>s</w:t>
+          </w:r>
           <w:proofErr w:type="spellEnd"/>
         </w:p>
         <w:p>
@@ -104,7 +1196,7 @@
           <w:r>
             <w:fldChar w:fldCharType="separate"/>
           </w:r>
-          <w:hyperlink w:anchor="_Toc230361109" w:history="1">
+          <w:hyperlink w:anchor="_Toc230888964" w:history="1">
             <w:r>
               <w:rPr>
                 <w:rStyle w:val="Enlla"/>
@@ -146,7 +1238,7 @@
                 <w:noProof/>
                 <w:webHidden/>
               </w:rPr>
-              <w:instrText xml:space="preserve"> PAGEREF _Toc230361109 \h </w:instrText>
+              <w:instrText xml:space="preserve"> PAGEREF _Toc230888964 \h </w:instrText>
             </w:r>
             <w:r>
               <w:rPr>
@@ -190,7 +1282,7 @@
               <w:lang w:val="es-ES" w:eastAsia="es-ES"/>
             </w:rPr>
           </w:pPr>
-          <w:hyperlink w:anchor="_Toc230361110" w:history="1">
+          <w:hyperlink w:anchor="_Toc230888965" w:history="1">
             <w:r>
               <w:rPr>
                 <w:rStyle w:val="Enlla"/>
@@ -232,7 +1324,7 @@
                 <w:noProof/>
                 <w:webHidden/>
               </w:rPr>
-              <w:instrText xml:space="preserve"> PAGEREF _Toc230361110 \h </w:instrText>
+              <w:instrText xml:space="preserve"> PAGEREF _Toc230888965 \h </w:instrText>
             </w:r>
             <w:r>
               <w:rPr>
@@ -276,7 +1368,7 @@
               <w:lang w:val="es-ES" w:eastAsia="es-ES"/>
             </w:rPr>
           </w:pPr>
-          <w:hyperlink w:anchor="_Toc230361111" w:history="1">
+          <w:hyperlink w:anchor="_Toc230888966" w:history="1">
             <w:r>
               <w:rPr>
                 <w:rStyle w:val="Enlla"/>
@@ -318,7 +1410,7 @@
                 <w:noProof/>
                 <w:webHidden/>
               </w:rPr>
-              <w:instrText xml:space="preserve"> PAGEREF _Toc230361111 \h </w:instrText>
+              <w:instrText xml:space="preserve"> PAGEREF _Toc230888966 \h </w:instrText>
             </w:r>
             <w:r>
               <w:rPr>
@@ -362,7 +1454,7 @@
               <w:lang w:val="es-ES" w:eastAsia="es-ES"/>
             </w:rPr>
           </w:pPr>
-          <w:hyperlink w:anchor="_Toc230361112" w:history="1">
+          <w:hyperlink w:anchor="_Toc230888967" w:history="1">
             <w:r>
               <w:rPr>
                 <w:rStyle w:val="Enlla"/>
@@ -404,7 +1496,7 @@
                 <w:noProof/>
                 <w:webHidden/>
               </w:rPr>
-              <w:instrText xml:space="preserve"> PAGEREF _Toc230361112 \h </w:instrText>
+              <w:instrText xml:space="preserve"> PAGEREF _Toc230888967 \h </w:instrText>
             </w:r>
             <w:r>
               <w:rPr>
@@ -448,7 +1540,7 @@
               <w:lang w:val="es-ES" w:eastAsia="es-ES"/>
             </w:rPr>
           </w:pPr>
-          <w:hyperlink w:anchor="_Toc230361113" w:history="1">
+          <w:hyperlink w:anchor="_Toc230888968" w:history="1">
             <w:r>
               <w:rPr>
                 <w:rStyle w:val="Enlla"/>
@@ -490,7 +1582,7 @@
                 <w:noProof/>
                 <w:webHidden/>
               </w:rPr>
-              <w:instrText xml:space="preserve"> PAGEREF _Toc230361113 \h </w:instrText>
+              <w:instrText xml:space="preserve"> PAGEREF _Toc230888968 \h </w:instrText>
             </w:r>
             <w:r>
               <w:rPr>
@@ -534,7 +1626,7 @@
               <w:lang w:val="es-ES" w:eastAsia="es-ES"/>
             </w:rPr>
           </w:pPr>
-          <w:hyperlink w:anchor="_Toc230361114" w:history="1">
+          <w:hyperlink w:anchor="_Toc230888969" w:history="1">
             <w:r>
               <w:rPr>
                 <w:rStyle w:val="Enlla"/>
@@ -576,7 +1668,7 @@
                 <w:noProof/>
                 <w:webHidden/>
               </w:rPr>
-              <w:instrText xml:space="preserve"> PAGEREF _Toc230361114 \h </w:instrText>
+              <w:instrText xml:space="preserve"> PAGEREF _Toc230888969 \h </w:instrText>
             </w:r>
             <w:r>
               <w:rPr>
@@ -620,7 +1712,7 @@
               <w:lang w:val="es-ES" w:eastAsia="es-ES"/>
             </w:rPr>
           </w:pPr>
-          <w:hyperlink w:anchor="_Toc230361115" w:history="1">
+          <w:hyperlink w:anchor="_Toc230888970" w:history="1">
             <w:r>
               <w:rPr>
                 <w:rStyle w:val="Enlla"/>
@@ -662,7 +1754,7 @@
                 <w:noProof/>
                 <w:webHidden/>
               </w:rPr>
-              <w:instrText xml:space="preserve"> PAGEREF _Toc230361115 \h </w:instrText>
+              <w:instrText xml:space="preserve"> PAGEREF _Toc230888970 \h </w:instrText>
             </w:r>
             <w:r>
               <w:rPr>
@@ -706,7 +1798,7 @@
               <w:lang w:val="es-ES" w:eastAsia="es-ES"/>
             </w:rPr>
           </w:pPr>
-          <w:hyperlink w:anchor="_Toc230361116" w:history="1">
+          <w:hyperlink w:anchor="_Toc230888971" w:history="1">
             <w:r>
               <w:rPr>
                 <w:rStyle w:val="Enlla"/>
@@ -748,7 +1840,7 @@
                 <w:noProof/>
                 <w:webHidden/>
               </w:rPr>
-              <w:instrText xml:space="preserve"> PAGEREF _Toc230361116 \h </w:instrText>
+              <w:instrText xml:space="preserve"> PAGEREF _Toc230888971 \h </w:instrText>
             </w:r>
             <w:r>
               <w:rPr>
@@ -792,7 +1884,7 @@
               <w:lang w:val="es-ES" w:eastAsia="es-ES"/>
             </w:rPr>
           </w:pPr>
-          <w:hyperlink w:anchor="_Toc230361117" w:history="1">
+          <w:hyperlink w:anchor="_Toc230888972" w:history="1">
             <w:r>
               <w:rPr>
                 <w:rStyle w:val="Enlla"/>
@@ -834,7 +1926,7 @@
                 <w:noProof/>
                 <w:webHidden/>
               </w:rPr>
-              <w:instrText xml:space="preserve"> PAGEREF _Toc230361117 \h </w:instrText>
+              <w:instrText xml:space="preserve"> PAGEREF _Toc230888972 \h </w:instrText>
             </w:r>
             <w:r>
               <w:rPr>
@@ -877,7 +1969,7 @@
               <w:lang w:val="es-ES" w:eastAsia="es-ES"/>
             </w:rPr>
           </w:pPr>
-          <w:hyperlink w:anchor="_Toc230361118" w:history="1">
+          <w:hyperlink w:anchor="_Toc230888973" w:history="1">
             <w:r>
               <w:rPr>
                 <w:rStyle w:val="Enlla"/>
@@ -904,7 +1996,7 @@
                 <w:noProof/>
                 <w:webHidden/>
               </w:rPr>
-              <w:instrText xml:space="preserve"> PAGEREF _Toc230361118 \h </w:instrText>
+              <w:instrText xml:space="preserve"> PAGEREF _Toc230888973 \h </w:instrText>
             </w:r>
             <w:r>
               <w:rPr>
@@ -947,7 +2039,7 @@
               <w:lang w:val="es-ES" w:eastAsia="es-ES"/>
             </w:rPr>
           </w:pPr>
-          <w:hyperlink w:anchor="_Toc230361119" w:history="1">
+          <w:hyperlink w:anchor="_Toc230888974" w:history="1">
             <w:r>
               <w:rPr>
                 <w:rStyle w:val="Enlla"/>
@@ -974,7 +2066,7 @@
                 <w:noProof/>
                 <w:webHidden/>
               </w:rPr>
-              <w:instrText xml:space="preserve"> PAGEREF _Toc230361119 \h </w:instrText>
+              <w:instrText xml:space="preserve"> PAGEREF _Toc230888974 \h </w:instrText>
             </w:r>
             <w:r>
               <w:rPr>
@@ -1017,7 +2109,7 @@
               <w:lang w:val="es-ES" w:eastAsia="es-ES"/>
             </w:rPr>
           </w:pPr>
-          <w:hyperlink w:anchor="_Toc230361120" w:history="1">
+          <w:hyperlink w:anchor="_Toc230888975" w:history="1">
             <w:r>
               <w:rPr>
                 <w:rStyle w:val="Enlla"/>
@@ -1044,7 +2136,7 @@
                 <w:noProof/>
                 <w:webHidden/>
               </w:rPr>
-              <w:instrText xml:space="preserve"> PAGEREF _Toc230361120 \h </w:instrText>
+              <w:instrText xml:space="preserve"> PAGEREF _Toc230888975 \h </w:instrText>
             </w:r>
             <w:r>
               <w:rPr>
@@ -1088,7 +2180,7 @@
               <w:lang w:val="es-ES" w:eastAsia="es-ES"/>
             </w:rPr>
           </w:pPr>
-          <w:hyperlink w:anchor="_Toc230361121" w:history="1">
+          <w:hyperlink w:anchor="_Toc230888976" w:history="1">
             <w:r>
               <w:rPr>
                 <w:rStyle w:val="Enlla"/>
@@ -1130,7 +2222,7 @@
                 <w:noProof/>
                 <w:webHidden/>
               </w:rPr>
-              <w:instrText xml:space="preserve"> PAGEREF _Toc230361121 \h </w:instrText>
+              <w:instrText xml:space="preserve"> PAGEREF _Toc230888976 \h </w:instrText>
             </w:r>
             <w:r>
               <w:rPr>
@@ -1173,7 +2265,7 @@
               <w:lang w:val="es-ES" w:eastAsia="es-ES"/>
             </w:rPr>
           </w:pPr>
-          <w:hyperlink w:anchor="_Toc230361122" w:history="1">
+          <w:hyperlink w:anchor="_Toc230888977" w:history="1">
             <w:r>
               <w:rPr>
                 <w:rStyle w:val="Enlla"/>
@@ -1200,7 +2292,7 @@
                 <w:noProof/>
                 <w:webHidden/>
               </w:rPr>
-              <w:instrText xml:space="preserve"> PAGEREF _Toc230361122 \h </w:instrText>
+              <w:instrText xml:space="preserve"> PAGEREF _Toc230888977 \h </w:instrText>
             </w:r>
             <w:r>
               <w:rPr>
@@ -1243,7 +2335,7 @@
               <w:lang w:val="es-ES" w:eastAsia="es-ES"/>
             </w:rPr>
           </w:pPr>
-          <w:hyperlink w:anchor="_Toc230361123" w:history="1">
+          <w:hyperlink w:anchor="_Toc230888978" w:history="1">
             <w:r>
               <w:rPr>
                 <w:rStyle w:val="Enlla"/>
@@ -1270,7 +2362,7 @@
                 <w:noProof/>
                 <w:webHidden/>
               </w:rPr>
-              <w:instrText xml:space="preserve"> PAGEREF _Toc230361123 \h </w:instrText>
+              <w:instrText xml:space="preserve"> PAGEREF _Toc230888978 \h </w:instrText>
             </w:r>
             <w:r>
               <w:rPr>
@@ -1314,7 +2406,7 @@
               <w:lang w:val="es-ES" w:eastAsia="es-ES"/>
             </w:rPr>
           </w:pPr>
-          <w:hyperlink w:anchor="_Toc230361124" w:history="1">
+          <w:hyperlink w:anchor="_Toc230888979" w:history="1">
             <w:r>
               <w:rPr>
                 <w:rStyle w:val="Enlla"/>
@@ -1356,7 +2448,7 @@
                 <w:noProof/>
                 <w:webHidden/>
               </w:rPr>
-              <w:instrText xml:space="preserve"> PAGEREF _Toc230361124 \h </w:instrText>
+              <w:instrText xml:space="preserve"> PAGEREF _Toc230888979 \h </w:instrText>
             </w:r>
             <w:r>
               <w:rPr>
@@ -1399,7 +2491,7 @@
               <w:lang w:val="es-ES" w:eastAsia="es-ES"/>
             </w:rPr>
           </w:pPr>
-          <w:hyperlink w:anchor="_Toc230361125" w:history="1">
+          <w:hyperlink w:anchor="_Toc230888980" w:history="1">
             <w:r>
               <w:rPr>
                 <w:rStyle w:val="Enlla"/>
@@ -1426,7 +2518,7 @@
                 <w:noProof/>
                 <w:webHidden/>
               </w:rPr>
-              <w:instrText xml:space="preserve"> PAGEREF _Toc230361125 \h </w:instrText>
+              <w:instrText xml:space="preserve"> PAGEREF _Toc230888980 \h </w:instrText>
             </w:r>
             <w:r>
               <w:rPr>
@@ -1469,7 +2561,7 @@
               <w:lang w:val="es-ES" w:eastAsia="es-ES"/>
             </w:rPr>
           </w:pPr>
-          <w:hyperlink w:anchor="_Toc230361126" w:history="1">
+          <w:hyperlink w:anchor="_Toc230888981" w:history="1">
             <w:r>
               <w:rPr>
                 <w:rStyle w:val="Enlla"/>
@@ -1496,7 +2588,7 @@
                 <w:noProof/>
                 <w:webHidden/>
               </w:rPr>
-              <w:instrText xml:space="preserve"> PAGEREF _Toc230361126 \h </w:instrText>
+              <w:instrText xml:space="preserve"> PAGEREF _Toc230888981 \h </w:instrText>
             </w:r>
             <w:r>
               <w:rPr>
@@ -1539,7 +2631,7 @@
               <w:lang w:val="es-ES" w:eastAsia="es-ES"/>
             </w:rPr>
           </w:pPr>
-          <w:hyperlink w:anchor="_Toc230361127" w:history="1">
+          <w:hyperlink w:anchor="_Toc230888982" w:history="1">
             <w:r>
               <w:rPr>
                 <w:rStyle w:val="Enlla"/>
@@ -1566,7 +2658,7 @@
                 <w:noProof/>
                 <w:webHidden/>
               </w:rPr>
-              <w:instrText xml:space="preserve"> PAGEREF _Toc230361127 \h </w:instrText>
+              <w:instrText xml:space="preserve"> PAGEREF _Toc230888982 \h </w:instrText>
             </w:r>
             <w:r>
               <w:rPr>
@@ -1609,7 +2701,7 @@
               <w:lang w:val="es-ES" w:eastAsia="es-ES"/>
             </w:rPr>
           </w:pPr>
-          <w:hyperlink w:anchor="_Toc230361128" w:history="1">
+          <w:hyperlink w:anchor="_Toc230888983" w:history="1">
             <w:r>
               <w:rPr>
                 <w:rStyle w:val="Enlla"/>
@@ -1636,7 +2728,7 @@
                 <w:noProof/>
                 <w:webHidden/>
               </w:rPr>
-              <w:instrText xml:space="preserve"> PAGEREF _Toc230361128 \h </w:instrText>
+              <w:instrText xml:space="preserve"> PAGEREF _Toc230888983 \h </w:instrText>
             </w:r>
             <w:r>
               <w:rPr>
@@ -1680,7 +2772,7 @@
               <w:lang w:val="es-ES" w:eastAsia="es-ES"/>
             </w:rPr>
           </w:pPr>
-          <w:hyperlink w:anchor="_Toc230361129" w:history="1">
+          <w:hyperlink w:anchor="_Toc230888984" w:history="1">
             <w:r>
               <w:rPr>
                 <w:rStyle w:val="Enlla"/>
@@ -1722,7 +2814,7 @@
                 <w:noProof/>
                 <w:webHidden/>
               </w:rPr>
-              <w:instrText xml:space="preserve"> PAGEREF _Toc230361129 \h </w:instrText>
+              <w:instrText xml:space="preserve"> PAGEREF _Toc230888984 \h </w:instrText>
             </w:r>
             <w:r>
               <w:rPr>
@@ -1766,7 +2858,7 @@
               <w:lang w:val="es-ES" w:eastAsia="es-ES"/>
             </w:rPr>
           </w:pPr>
-          <w:hyperlink w:anchor="_Toc230361130" w:history="1">
+          <w:hyperlink w:anchor="_Toc230888985" w:history="1">
             <w:r>
               <w:rPr>
                 <w:rStyle w:val="Enlla"/>
@@ -1808,7 +2900,7 @@
                 <w:noProof/>
                 <w:webHidden/>
               </w:rPr>
-              <w:instrText xml:space="preserve"> PAGEREF _Toc230361130 \h </w:instrText>
+              <w:instrText xml:space="preserve"> PAGEREF _Toc230888985 \h </w:instrText>
             </w:r>
             <w:r>
               <w:rPr>
@@ -1852,7 +2944,7 @@
               <w:lang w:val="es-ES" w:eastAsia="es-ES"/>
             </w:rPr>
           </w:pPr>
-          <w:hyperlink w:anchor="_Toc230361131" w:history="1">
+          <w:hyperlink w:anchor="_Toc230888986" w:history="1">
             <w:r>
               <w:rPr>
                 <w:rStyle w:val="Enlla"/>
@@ -1894,7 +2986,7 @@
                 <w:noProof/>
                 <w:webHidden/>
               </w:rPr>
-              <w:instrText xml:space="preserve"> PAGEREF _Toc230361131 \h </w:instrText>
+              <w:instrText xml:space="preserve"> PAGEREF _Toc230888986 \h </w:instrText>
             </w:r>
             <w:r>
               <w:rPr>
@@ -1938,7 +3030,7 @@
               <w:lang w:val="es-ES" w:eastAsia="es-ES"/>
             </w:rPr>
           </w:pPr>
-          <w:hyperlink w:anchor="_Toc230361132" w:history="1">
+          <w:hyperlink w:anchor="_Toc230888987" w:history="1">
             <w:r>
               <w:rPr>
                 <w:rStyle w:val="Enlla"/>
@@ -1980,7 +3072,7 @@
                 <w:noProof/>
                 <w:webHidden/>
               </w:rPr>
-              <w:instrText xml:space="preserve"> PAGEREF _Toc230361132 \h </w:instrText>
+              <w:instrText xml:space="preserve"> PAGEREF _Toc230888987 \h </w:instrText>
             </w:r>
             <w:r>
               <w:rPr>
@@ -2024,7 +3116,7 @@
               <w:lang w:val="es-ES" w:eastAsia="es-ES"/>
             </w:rPr>
           </w:pPr>
-          <w:hyperlink w:anchor="_Toc230361133" w:history="1">
+          <w:hyperlink w:anchor="_Toc230888988" w:history="1">
             <w:r>
               <w:rPr>
                 <w:rStyle w:val="Enlla"/>
@@ -2066,7 +3158,7 @@
                 <w:noProof/>
                 <w:webHidden/>
               </w:rPr>
-              <w:instrText xml:space="preserve"> PAGEREF _Toc230361133 \h </w:instrText>
+              <w:instrText xml:space="preserve"> PAGEREF _Toc230888988 \h </w:instrText>
             </w:r>
             <w:r>
               <w:rPr>
@@ -2110,7 +3202,7 @@
               <w:lang w:val="es-ES" w:eastAsia="es-ES"/>
             </w:rPr>
           </w:pPr>
-          <w:hyperlink w:anchor="_Toc230361134" w:history="1">
+          <w:hyperlink w:anchor="_Toc230888989" w:history="1">
             <w:r>
               <w:rPr>
                 <w:rStyle w:val="Enlla"/>
@@ -2152,7 +3244,7 @@
                 <w:noProof/>
                 <w:webHidden/>
               </w:rPr>
-              <w:instrText xml:space="preserve"> PAGEREF _Toc230361134 \h </w:instrText>
+              <w:instrText xml:space="preserve"> PAGEREF _Toc230888989 \h </w:instrText>
             </w:r>
             <w:r>
               <w:rPr>
@@ -2196,7 +3288,7 @@
               <w:lang w:val="es-ES" w:eastAsia="es-ES"/>
             </w:rPr>
           </w:pPr>
-          <w:hyperlink w:anchor="_Toc230361135" w:history="1">
+          <w:hyperlink w:anchor="_Toc230888990" w:history="1">
             <w:r>
               <w:rPr>
                 <w:rStyle w:val="Enlla"/>
@@ -2238,7 +3330,7 @@
                 <w:noProof/>
                 <w:webHidden/>
               </w:rPr>
-              <w:instrText xml:space="preserve"> PAGEREF _Toc230361135 \h </w:instrText>
+              <w:instrText xml:space="preserve"> PAGEREF _Toc230888990 \h </w:instrText>
             </w:r>
             <w:r>
               <w:rPr>
@@ -2282,7 +3374,7 @@
               <w:lang w:val="es-ES" w:eastAsia="es-ES"/>
             </w:rPr>
           </w:pPr>
-          <w:hyperlink w:anchor="_Toc230361136" w:history="1">
+          <w:hyperlink w:anchor="_Toc230888991" w:history="1">
             <w:r>
               <w:rPr>
                 <w:rStyle w:val="Enlla"/>
@@ -2324,7 +3416,7 @@
                 <w:noProof/>
                 <w:webHidden/>
               </w:rPr>
-              <w:instrText xml:space="preserve"> PAGEREF _Toc230361136 \h </w:instrText>
+              <w:instrText xml:space="preserve"> PAGEREF _Toc230888991 \h </w:instrText>
             </w:r>
             <w:r>
               <w:rPr>
@@ -2368,7 +3460,7 @@
               <w:lang w:val="es-ES" w:eastAsia="es-ES"/>
             </w:rPr>
           </w:pPr>
-          <w:hyperlink w:anchor="_Toc230361137" w:history="1">
+          <w:hyperlink w:anchor="_Toc230888992" w:history="1">
             <w:r>
               <w:rPr>
                 <w:rStyle w:val="Enlla"/>
@@ -2410,7 +3502,7 @@
                 <w:noProof/>
                 <w:webHidden/>
               </w:rPr>
-              <w:instrText xml:space="preserve"> PAGEREF _Toc230361137 \h </w:instrText>
+              <w:instrText xml:space="preserve"> PAGEREF _Toc230888992 \h </w:instrText>
             </w:r>
             <w:r>
               <w:rPr>
@@ -2454,7 +3546,7 @@
               <w:lang w:val="es-ES" w:eastAsia="es-ES"/>
             </w:rPr>
           </w:pPr>
-          <w:hyperlink w:anchor="_Toc230361138" w:history="1">
+          <w:hyperlink w:anchor="_Toc230888993" w:history="1">
             <w:r>
               <w:rPr>
                 <w:rStyle w:val="Enlla"/>
@@ -2496,7 +3588,7 @@
                 <w:noProof/>
                 <w:webHidden/>
               </w:rPr>
-              <w:instrText xml:space="preserve"> PAGEREF _Toc230361138 \h </w:instrText>
+              <w:instrText xml:space="preserve"> PAGEREF _Toc230888993 \h </w:instrText>
             </w:r>
             <w:r>
               <w:rPr>
@@ -2540,7 +3632,7 @@
               <w:lang w:val="es-ES" w:eastAsia="es-ES"/>
             </w:rPr>
           </w:pPr>
-          <w:hyperlink w:anchor="_Toc230361139" w:history="1">
+          <w:hyperlink w:anchor="_Toc230888994" w:history="1">
             <w:r>
               <w:rPr>
                 <w:rStyle w:val="Enlla"/>
@@ -2582,7 +3674,7 @@
                 <w:noProof/>
                 <w:webHidden/>
               </w:rPr>
-              <w:instrText xml:space="preserve"> PAGEREF _Toc230361139 \h </w:instrText>
+              <w:instrText xml:space="preserve"> PAGEREF _Toc230888994 \h </w:instrText>
             </w:r>
             <w:r>
               <w:rPr>
@@ -2626,7 +3718,7 @@
               <w:lang w:val="es-ES" w:eastAsia="es-ES"/>
             </w:rPr>
           </w:pPr>
-          <w:hyperlink w:anchor="_Toc230361140" w:history="1">
+          <w:hyperlink w:anchor="_Toc230888995" w:history="1">
             <w:r>
               <w:rPr>
                 <w:rStyle w:val="Enlla"/>
@@ -2668,7 +3760,7 @@
                 <w:noProof/>
                 <w:webHidden/>
               </w:rPr>
-              <w:instrText xml:space="preserve"> PAGEREF _Toc230361140 \h </w:instrText>
+              <w:instrText xml:space="preserve"> PAGEREF _Toc230888995 \h </w:instrText>
             </w:r>
             <w:r>
               <w:rPr>
@@ -2712,7 +3804,7 @@
               <w:lang w:val="es-ES" w:eastAsia="es-ES"/>
             </w:rPr>
           </w:pPr>
-          <w:hyperlink w:anchor="_Toc230361141" w:history="1">
+          <w:hyperlink w:anchor="_Toc230888996" w:history="1">
             <w:r>
               <w:rPr>
                 <w:rStyle w:val="Enlla"/>
@@ -2754,7 +3846,7 @@
                 <w:noProof/>
                 <w:webHidden/>
               </w:rPr>
-              <w:instrText xml:space="preserve"> PAGEREF _Toc230361141 \h </w:instrText>
+              <w:instrText xml:space="preserve"> PAGEREF _Toc230888996 \h </w:instrText>
             </w:r>
             <w:r>
               <w:rPr>
@@ -2798,7 +3890,7 @@
               <w:lang w:val="es-ES" w:eastAsia="es-ES"/>
             </w:rPr>
           </w:pPr>
-          <w:hyperlink w:anchor="_Toc230361142" w:history="1">
+          <w:hyperlink w:anchor="_Toc230888997" w:history="1">
             <w:r>
               <w:rPr>
                 <w:rStyle w:val="Enlla"/>
@@ -2840,7 +3932,7 @@
                 <w:noProof/>
                 <w:webHidden/>
               </w:rPr>
-              <w:instrText xml:space="preserve"> PAGEREF _Toc230361142 \h </w:instrText>
+              <w:instrText xml:space="preserve"> PAGEREF _Toc230888997 \h </w:instrText>
             </w:r>
             <w:r>
               <w:rPr>
@@ -2884,7 +3976,7 @@
               <w:lang w:val="es-ES" w:eastAsia="es-ES"/>
             </w:rPr>
           </w:pPr>
-          <w:hyperlink w:anchor="_Toc230361143" w:history="1">
+          <w:hyperlink w:anchor="_Toc230888998" w:history="1">
             <w:r>
               <w:rPr>
                 <w:rStyle w:val="Enlla"/>
@@ -2926,7 +4018,7 @@
                 <w:noProof/>
                 <w:webHidden/>
               </w:rPr>
-              <w:instrText xml:space="preserve"> PAGEREF _Toc230361143 \h </w:instrText>
+              <w:instrText xml:space="preserve"> PAGEREF _Toc230888998 \h </w:instrText>
             </w:r>
             <w:r>
               <w:rPr>
@@ -2969,7 +4061,7 @@
               <w:lang w:val="es-ES" w:eastAsia="es-ES"/>
             </w:rPr>
           </w:pPr>
-          <w:hyperlink w:anchor="_Toc230361144" w:history="1">
+          <w:hyperlink w:anchor="_Toc230888999" w:history="1">
             <w:r>
               <w:rPr>
                 <w:rStyle w:val="Enlla"/>
@@ -2996,7 +4088,7 @@
                 <w:noProof/>
                 <w:webHidden/>
               </w:rPr>
-              <w:instrText xml:space="preserve"> PAGEREF _Toc230361144 \h </w:instrText>
+              <w:instrText xml:space="preserve"> PAGEREF _Toc230888999 \h </w:instrText>
             </w:r>
             <w:r>
               <w:rPr>
@@ -3039,7 +4131,7 @@
               <w:lang w:val="es-ES" w:eastAsia="es-ES"/>
             </w:rPr>
           </w:pPr>
-          <w:hyperlink w:anchor="_Toc230361145" w:history="1">
+          <w:hyperlink w:anchor="_Toc230889000" w:history="1">
             <w:r>
               <w:rPr>
                 <w:rStyle w:val="Enlla"/>
@@ -3066,7 +4158,7 @@
                 <w:noProof/>
                 <w:webHidden/>
               </w:rPr>
-              <w:instrText xml:space="preserve"> PAGEREF _Toc230361145 \h </w:instrText>
+              <w:instrText xml:space="preserve"> PAGEREF _Toc230889000 \h </w:instrText>
             </w:r>
             <w:r>
               <w:rPr>
@@ -3109,7 +4201,7 @@
               <w:lang w:val="es-ES" w:eastAsia="es-ES"/>
             </w:rPr>
           </w:pPr>
-          <w:hyperlink w:anchor="_Toc230361146" w:history="1">
+          <w:hyperlink w:anchor="_Toc230889001" w:history="1">
             <w:r>
               <w:rPr>
                 <w:rStyle w:val="Enlla"/>
@@ -3136,7 +4228,7 @@
                 <w:noProof/>
                 <w:webHidden/>
               </w:rPr>
-              <w:instrText xml:space="preserve"> PAGEREF _Toc230361146 \h </w:instrText>
+              <w:instrText xml:space="preserve"> PAGEREF _Toc230889001 \h </w:instrText>
             </w:r>
             <w:r>
               <w:rPr>
@@ -3179,7 +4271,7 @@
               <w:lang w:val="es-ES" w:eastAsia="es-ES"/>
             </w:rPr>
           </w:pPr>
-          <w:hyperlink w:anchor="_Toc230361147" w:history="1">
+          <w:hyperlink w:anchor="_Toc230889002" w:history="1">
             <w:r>
               <w:rPr>
                 <w:rStyle w:val="Enlla"/>
@@ -3206,7 +4298,7 @@
                 <w:noProof/>
                 <w:webHidden/>
               </w:rPr>
-              <w:instrText xml:space="preserve"> PAGEREF _Toc230361147 \h </w:instrText>
+              <w:instrText xml:space="preserve"> PAGEREF _Toc230889002 \h </w:instrText>
             </w:r>
             <w:r>
               <w:rPr>
@@ -3249,7 +4341,7 @@
               <w:lang w:val="es-ES" w:eastAsia="es-ES"/>
             </w:rPr>
           </w:pPr>
-          <w:hyperlink w:anchor="_Toc230361148" w:history="1">
+          <w:hyperlink w:anchor="_Toc230889003" w:history="1">
             <w:r>
               <w:rPr>
                 <w:rStyle w:val="Enlla"/>
@@ -3276,7 +4368,7 @@
                 <w:noProof/>
                 <w:webHidden/>
               </w:rPr>
-              <w:instrText xml:space="preserve"> PAGEREF _Toc230361148 \h </w:instrText>
+              <w:instrText xml:space="preserve"> PAGEREF _Toc230889003 \h </w:instrText>
             </w:r>
             <w:r>
               <w:rPr>
@@ -3320,7 +4412,7 @@
               <w:lang w:val="es-ES" w:eastAsia="es-ES"/>
             </w:rPr>
           </w:pPr>
-          <w:hyperlink w:anchor="_Toc230361149" w:history="1">
+          <w:hyperlink w:anchor="_Toc230889004" w:history="1">
             <w:r>
               <w:rPr>
                 <w:rStyle w:val="Enlla"/>
@@ -3362,7 +4454,7 @@
                 <w:noProof/>
                 <w:webHidden/>
               </w:rPr>
-              <w:instrText xml:space="preserve"> PAGEREF _Toc230361149 \h </w:instrText>
+              <w:instrText xml:space="preserve"> PAGEREF _Toc230889004 \h </w:instrText>
             </w:r>
             <w:r>
               <w:rPr>
@@ -3405,7 +4497,7 @@
               <w:lang w:val="es-ES" w:eastAsia="es-ES"/>
             </w:rPr>
           </w:pPr>
-          <w:hyperlink w:anchor="_Toc230361150" w:history="1">
+          <w:hyperlink w:anchor="_Toc230889005" w:history="1">
             <w:r>
               <w:rPr>
                 <w:rStyle w:val="Enlla"/>
@@ -3432,7 +4524,7 @@
                 <w:noProof/>
                 <w:webHidden/>
               </w:rPr>
-              <w:instrText xml:space="preserve"> PAGEREF _Toc230361150 \h </w:instrText>
+              <w:instrText xml:space="preserve"> PAGEREF _Toc230889005 \h </w:instrText>
             </w:r>
             <w:r>
               <w:rPr>
@@ -3475,7 +4567,7 @@
               <w:lang w:val="es-ES" w:eastAsia="es-ES"/>
             </w:rPr>
           </w:pPr>
-          <w:hyperlink w:anchor="_Toc230361151" w:history="1">
+          <w:hyperlink w:anchor="_Toc230889006" w:history="1">
             <w:r>
               <w:rPr>
                 <w:rStyle w:val="Enlla"/>
@@ -3502,7 +4594,7 @@
                 <w:noProof/>
                 <w:webHidden/>
               </w:rPr>
-              <w:instrText xml:space="preserve"> PAGEREF _Toc230361151 \h </w:instrText>
+              <w:instrText xml:space="preserve"> PAGEREF _Toc230889006 \h </w:instrText>
             </w:r>
             <w:r>
               <w:rPr>
@@ -3545,7 +4637,7 @@
               <w:lang w:val="es-ES" w:eastAsia="es-ES"/>
             </w:rPr>
           </w:pPr>
-          <w:hyperlink w:anchor="_Toc230361152" w:history="1">
+          <w:hyperlink w:anchor="_Toc230889007" w:history="1">
             <w:r>
               <w:rPr>
                 <w:rStyle w:val="Enlla"/>
@@ -3572,7 +4664,7 @@
                 <w:noProof/>
                 <w:webHidden/>
               </w:rPr>
-              <w:instrText xml:space="preserve"> PAGEREF _Toc230361152 \h </w:instrText>
+              <w:instrText xml:space="preserve"> PAGEREF _Toc230889007 \h </w:instrText>
             </w:r>
             <w:r>
               <w:rPr>
@@ -3615,7 +4707,7 @@
               <w:lang w:val="es-ES" w:eastAsia="es-ES"/>
             </w:rPr>
           </w:pPr>
-          <w:hyperlink w:anchor="_Toc230361153" w:history="1">
+          <w:hyperlink w:anchor="_Toc230889008" w:history="1">
             <w:r>
               <w:rPr>
                 <w:rStyle w:val="Enlla"/>
@@ -3642,7 +4734,7 @@
                 <w:noProof/>
                 <w:webHidden/>
               </w:rPr>
-              <w:instrText xml:space="preserve"> PAGEREF _Toc230361153 \h </w:instrText>
+              <w:instrText xml:space="preserve"> PAGEREF _Toc230889008 \h </w:instrText>
             </w:r>
             <w:r>
               <w:rPr>
@@ -3685,7 +4777,7 @@
               <w:lang w:val="es-ES" w:eastAsia="es-ES"/>
             </w:rPr>
           </w:pPr>
-          <w:hyperlink w:anchor="_Toc230361154" w:history="1">
+          <w:hyperlink w:anchor="_Toc230889009" w:history="1">
             <w:r>
               <w:rPr>
                 <w:rStyle w:val="Enlla"/>
@@ -3712,7 +4804,7 @@
                 <w:noProof/>
                 <w:webHidden/>
               </w:rPr>
-              <w:instrText xml:space="preserve"> PAGEREF _Toc230361154 \h </w:instrText>
+              <w:instrText xml:space="preserve"> PAGEREF _Toc230889009 \h </w:instrText>
             </w:r>
             <w:r>
               <w:rPr>
@@ -3755,7 +4847,7 @@
               <w:lang w:val="es-ES" w:eastAsia="es-ES"/>
             </w:rPr>
           </w:pPr>
-          <w:hyperlink w:anchor="_Toc230361155" w:history="1">
+          <w:hyperlink w:anchor="_Toc230889010" w:history="1">
             <w:r>
               <w:rPr>
                 <w:rStyle w:val="Enlla"/>
@@ -3782,7 +4874,7 @@
                 <w:noProof/>
                 <w:webHidden/>
               </w:rPr>
-              <w:instrText xml:space="preserve"> PAGEREF _Toc230361155 \h </w:instrText>
+              <w:instrText xml:space="preserve"> PAGEREF _Toc230889010 \h </w:instrText>
             </w:r>
             <w:r>
               <w:rPr>
@@ -3839,7 +4931,7 @@
         <w:pageBreakBefore/>
         <w:ind w:left="357" w:hanging="357"/>
       </w:pPr>
-      <w:bookmarkStart w:id="0" w:name="_Toc230361109"/>
+      <w:bookmarkStart w:id="0" w:name="_Toc230888964"/>
       <w:r>
         <w:lastRenderedPageBreak/>
         <w:t>Introducció</w:t>
@@ -3903,7 +4995,7 @@
       <w:pPr>
         <w:pStyle w:val="Ttol2"/>
       </w:pPr>
-      <w:bookmarkStart w:id="1" w:name="_Toc230361110"/>
+      <w:bookmarkStart w:id="1" w:name="_Toc230888965"/>
       <w:r>
         <w:t>Enfocament adoptat: backend com a servei</w:t>
       </w:r>
@@ -3981,7 +5073,7 @@
       <w:pPr>
         <w:pStyle w:val="Ttol2"/>
       </w:pPr>
-      <w:bookmarkStart w:id="2" w:name="_Toc230361111"/>
+      <w:bookmarkStart w:id="2" w:name="_Toc230888966"/>
       <w:r>
         <w:t xml:space="preserve">I per què </w:t>
       </w:r>
@@ -4042,7 +5134,7 @@
       <w:pPr>
         <w:pStyle w:val="Ttol1"/>
       </w:pPr>
-      <w:bookmarkStart w:id="3" w:name="_Toc230361112"/>
+      <w:bookmarkStart w:id="3" w:name="_Toc230888967"/>
       <w:r>
         <w:lastRenderedPageBreak/>
         <w:t xml:space="preserve">Paquet </w:t>
@@ -4070,7 +5162,7 @@
       <w:pPr>
         <w:pStyle w:val="Ttol2"/>
       </w:pPr>
-      <w:bookmarkStart w:id="4" w:name="_Toc230361113"/>
+      <w:bookmarkStart w:id="4" w:name="_Toc230888968"/>
       <w:r>
         <w:t>Estructura</w:t>
       </w:r>
@@ -4193,7 +5285,7 @@
       <w:pPr>
         <w:pStyle w:val="Ttol2"/>
       </w:pPr>
-      <w:bookmarkStart w:id="5" w:name="_Toc230361114"/>
+      <w:bookmarkStart w:id="5" w:name="_Toc230888969"/>
       <w:r>
         <w:t>Descripció dels fitxers inclosos</w:t>
       </w:r>
@@ -4455,80 +5547,72 @@
     </w:p>
     <w:p>
       <w:r>
-        <w:t xml:space="preserve">Inclou les instruccions bàsiques perquè l’alumnat </w:t>
+        <w:t>Inclou les instruccions bàsiques perquè l’alumnat puga posar en marxa el sistema i començar a treballar.</w:t>
+      </w:r>
+    </w:p>
+    <w:p>
+      <w:r>
+        <w:t>Està dissenyat amb un enfocament pràctic i simplificat.</w:t>
+      </w:r>
+    </w:p>
+    <w:p>
+      <w:pPr>
+        <w:pStyle w:val="Ttol2"/>
+      </w:pPr>
+      <w:bookmarkStart w:id="6" w:name="_Toc230888970"/>
+      <w:r>
+        <w:t>Funcionament des del punt de vista de l’alumne</w:t>
+      </w:r>
+      <w:bookmarkEnd w:id="6"/>
+    </w:p>
+    <w:p>
+      <w:r>
+        <w:t xml:space="preserve">Des del punt de vista de l’alumnat, el sistema funciona de manera molt </w:t>
+      </w:r>
+      <w:r>
+        <w:t>senzilla.</w:t>
+      </w:r>
+    </w:p>
+    <w:p>
+      <w:r>
+        <w:t xml:space="preserve">Una vegada descarregat el paquet i instal·lat </w:t>
       </w:r>
       <w:proofErr w:type="spellStart"/>
       <w:r>
-        <w:t>puga</w:t>
+        <w:t>Docker</w:t>
       </w:r>
       <w:proofErr w:type="spellEnd"/>
       <w:r>
-        <w:t xml:space="preserve"> posar en marxa el sistema i començar a treballar.</w:t>
-      </w:r>
-    </w:p>
-    <w:p>
-      <w:r>
-        <w:t>Està dissenyat amb un enfocament pràctic i simplificat.</w:t>
-      </w:r>
-    </w:p>
-    <w:p>
-      <w:pPr>
-        <w:pStyle w:val="Ttol2"/>
-      </w:pPr>
-      <w:bookmarkStart w:id="6" w:name="_Toc230361115"/>
-      <w:r>
-        <w:t>Funcionament des del punt de vista de l’alumne</w:t>
-      </w:r>
-      <w:bookmarkEnd w:id="6"/>
-    </w:p>
-    <w:p>
-      <w:r>
-        <w:t xml:space="preserve">Des del punt de vista de l’alumnat, el sistema funciona de manera molt </w:t>
-      </w:r>
-      <w:r>
-        <w:t>senzilla.</w:t>
-      </w:r>
-    </w:p>
-    <w:p>
-      <w:r>
-        <w:t xml:space="preserve">Una vegada descarregat el paquet i instal·lat </w:t>
+        <w:t>, només cal executar unes poques comandes per a posar en marxa el backend.</w:t>
+      </w:r>
+    </w:p>
+    <w:p>
+      <w:r>
+        <w:t xml:space="preserve">La primera vegada és necessari </w:t>
+      </w:r>
+      <w:r>
+        <w:t>restaurar</w:t>
+      </w:r>
+      <w:r>
+        <w:t xml:space="preserve"> la base de dades a partir del </w:t>
       </w:r>
       <w:proofErr w:type="spellStart"/>
       <w:r>
-        <w:t>Docker</w:t>
+        <w:t>backup</w:t>
       </w:r>
       <w:proofErr w:type="spellEnd"/>
       <w:r>
-        <w:t>, només cal executar unes poques comandes per a posar en marxa el backend.</w:t>
-      </w:r>
-    </w:p>
-    <w:p>
-      <w:r>
-        <w:t xml:space="preserve">La primera vegada és necessari </w:t>
-      </w:r>
-      <w:r>
-        <w:t>restaurar</w:t>
-      </w:r>
-      <w:r>
-        <w:t xml:space="preserve"> la base de dades a partir del </w:t>
+        <w:t xml:space="preserve"> proporcionat. A partir d’aquest moment, el sistema manté les dades creades i no cal repetir aquest pas</w:t>
+      </w:r>
+      <w:r>
+        <w:t xml:space="preserve"> a no ser que es </w:t>
       </w:r>
       <w:proofErr w:type="spellStart"/>
       <w:r>
-        <w:t>backup</w:t>
+        <w:t>vulga</w:t>
       </w:r>
       <w:proofErr w:type="spellEnd"/>
       <w:r>
-        <w:t xml:space="preserve"> proporcionat. A partir d’aquest moment, el sistema manté les dades creades i no cal repetir aquest pas</w:t>
-      </w:r>
-      <w:r>
-        <w:t xml:space="preserve"> a no ser que es </w:t>
-      </w:r>
-      <w:proofErr w:type="spellStart"/>
-      <w:r>
-        <w:t>vulga</w:t>
-      </w:r>
-      <w:proofErr w:type="spellEnd"/>
-      <w:r>
         <w:t xml:space="preserve"> començar de nou des de 0</w:t>
       </w:r>
       <w:r>
@@ -4549,7 +5633,7 @@
       <w:pPr>
         <w:pStyle w:val="Ttol1"/>
       </w:pPr>
-      <w:bookmarkStart w:id="7" w:name="_Toc230361116"/>
+      <w:bookmarkStart w:id="7" w:name="_Toc230888971"/>
       <w:proofErr w:type="spellStart"/>
       <w:r>
         <w:t>Descripcio</w:t>
@@ -4575,7 +5659,7 @@
       <w:pPr>
         <w:pStyle w:val="Ttol2"/>
       </w:pPr>
-      <w:bookmarkStart w:id="8" w:name="_Toc230361117"/>
+      <w:bookmarkStart w:id="8" w:name="_Toc230888972"/>
       <w:proofErr w:type="spellStart"/>
       <w:r>
         <w:t>docker-compose.yml</w:t>
@@ -4671,6 +5755,9 @@
         <w:jc w:val="center"/>
       </w:pPr>
       <w:r>
+        <w:rPr>
+          <w:noProof/>
+        </w:rPr>
         <w:lastRenderedPageBreak/>
         <w:drawing>
           <wp:inline distT="0" distB="0" distL="0" distR="0" wp14:anchorId="2DC6A0CF" wp14:editId="5BA7F8A3">
@@ -4688,7 +5775,7 @@
                     <pic:cNvPicPr/>
                   </pic:nvPicPr>
                   <pic:blipFill>
-                    <a:blip r:embed="rId7"/>
+                    <a:blip r:embed="rId12"/>
                     <a:stretch>
                       <a:fillRect/>
                     </a:stretch>
@@ -4716,14 +5803,27 @@
       <w:r>
         <w:t xml:space="preserve">Figura </w:t>
       </w:r>
-      <w:fldSimple w:instr=" SEQ Figura \* ARABIC ">
-        <w:r>
-          <w:rPr>
-            <w:noProof/>
-          </w:rPr>
-          <w:t>1</w:t>
-        </w:r>
-      </w:fldSimple>
+      <w:r>
+        <w:fldChar w:fldCharType="begin"/>
+      </w:r>
+      <w:r>
+        <w:instrText xml:space="preserve"> SEQ Figura \* ARABIC </w:instrText>
+      </w:r>
+      <w:r>
+        <w:fldChar w:fldCharType="separate"/>
+      </w:r>
+      <w:r>
+        <w:rPr>
+          <w:noProof/>
+        </w:rPr>
+        <w:t>1</w:t>
+      </w:r>
+      <w:r>
+        <w:rPr>
+          <w:noProof/>
+        </w:rPr>
+        <w:fldChar w:fldCharType="end"/>
+      </w:r>
       <w:r>
         <w:t xml:space="preserve"> Contingut de </w:t>
       </w:r>
@@ -4737,7 +5837,7 @@
       <w:pPr>
         <w:pStyle w:val="Ttol3"/>
       </w:pPr>
-      <w:bookmarkStart w:id="9" w:name="_Toc230361118"/>
+      <w:bookmarkStart w:id="9" w:name="_Toc230888973"/>
       <w:r>
         <w:t>Configuració del servei de base de dades</w:t>
       </w:r>
@@ -4891,7 +5991,7 @@
       <w:pPr>
         <w:pStyle w:val="Ttol3"/>
       </w:pPr>
-      <w:bookmarkStart w:id="10" w:name="_Toc230361119"/>
+      <w:bookmarkStart w:id="10" w:name="_Toc230888974"/>
       <w:r>
         <w:t>Configuració</w:t>
       </w:r>
@@ -5007,6 +6107,9 @@
         <w:keepNext/>
       </w:pPr>
       <w:r>
+        <w:rPr>
+          <w:noProof/>
+        </w:rPr>
         <w:drawing>
           <wp:inline distT="0" distB="0" distL="0" distR="0" wp14:anchorId="1369C86C" wp14:editId="139CE4B1">
             <wp:extent cx="5400040" cy="2092960"/>
@@ -5023,7 +6126,7 @@
                     <pic:cNvPicPr/>
                   </pic:nvPicPr>
                   <pic:blipFill>
-                    <a:blip r:embed="rId8"/>
+                    <a:blip r:embed="rId13"/>
                     <a:stretch>
                       <a:fillRect/>
                     </a:stretch>
@@ -5051,14 +6154,27 @@
       <w:r>
         <w:t xml:space="preserve">Figura </w:t>
       </w:r>
-      <w:fldSimple w:instr=" SEQ Figura \* ARABIC ">
-        <w:r>
-          <w:rPr>
-            <w:noProof/>
-          </w:rPr>
-          <w:t>2</w:t>
-        </w:r>
-      </w:fldSimple>
+      <w:r>
+        <w:fldChar w:fldCharType="begin"/>
+      </w:r>
+      <w:r>
+        <w:instrText xml:space="preserve"> SEQ Figura \* ARABIC </w:instrText>
+      </w:r>
+      <w:r>
+        <w:fldChar w:fldCharType="separate"/>
+      </w:r>
+      <w:r>
+        <w:rPr>
+          <w:noProof/>
+        </w:rPr>
+        <w:t>2</w:t>
+      </w:r>
+      <w:r>
+        <w:rPr>
+          <w:noProof/>
+        </w:rPr>
+        <w:fldChar w:fldCharType="end"/>
+      </w:r>
       <w:r>
         <w:t xml:space="preserve"> Contenidors karma-api (api) i </w:t>
       </w:r>
@@ -5083,7 +6199,7 @@
       <w:pPr>
         <w:pStyle w:val="Ttol3"/>
       </w:pPr>
-      <w:bookmarkStart w:id="11" w:name="_Toc230361120"/>
+      <w:bookmarkStart w:id="11" w:name="_Toc230888975"/>
       <w:r>
         <w:t>Volums i persistència de dades</w:t>
       </w:r>
@@ -5107,6 +6223,9 @@
         <w:keepNext/>
       </w:pPr>
       <w:r>
+        <w:rPr>
+          <w:noProof/>
+        </w:rPr>
         <w:drawing>
           <wp:inline distT="0" distB="0" distL="0" distR="0" wp14:anchorId="2FF72B8C" wp14:editId="30E755B0">
             <wp:extent cx="5400040" cy="1112520"/>
@@ -5123,7 +6242,7 @@
                     <pic:cNvPicPr/>
                   </pic:nvPicPr>
                   <pic:blipFill>
-                    <a:blip r:embed="rId9"/>
+                    <a:blip r:embed="rId14"/>
                     <a:stretch>
                       <a:fillRect/>
                     </a:stretch>
@@ -5151,14 +6270,27 @@
       <w:r>
         <w:t xml:space="preserve">Figura </w:t>
       </w:r>
-      <w:fldSimple w:instr=" SEQ Figura \* ARABIC ">
-        <w:r>
-          <w:rPr>
-            <w:noProof/>
-          </w:rPr>
-          <w:t>3</w:t>
-        </w:r>
-      </w:fldSimple>
+      <w:r>
+        <w:fldChar w:fldCharType="begin"/>
+      </w:r>
+      <w:r>
+        <w:instrText xml:space="preserve"> SEQ Figura \* ARABIC </w:instrText>
+      </w:r>
+      <w:r>
+        <w:fldChar w:fldCharType="separate"/>
+      </w:r>
+      <w:r>
+        <w:rPr>
+          <w:noProof/>
+        </w:rPr>
+        <w:t>3</w:t>
+      </w:r>
+      <w:r>
+        <w:rPr>
+          <w:noProof/>
+        </w:rPr>
+        <w:fldChar w:fldCharType="end"/>
+      </w:r>
       <w:r>
         <w:t xml:space="preserve"> Volum </w:t>
       </w:r>
@@ -5237,7 +6369,7 @@
       <w:pPr>
         <w:pStyle w:val="Ttol2"/>
       </w:pPr>
-      <w:bookmarkStart w:id="12" w:name="_Toc230361121"/>
+      <w:bookmarkStart w:id="12" w:name="_Toc230888976"/>
       <w:proofErr w:type="spellStart"/>
       <w:r>
         <w:t>Dockerfile</w:t>
@@ -5318,6 +6450,9 @@
         <w:jc w:val="center"/>
       </w:pPr>
       <w:r>
+        <w:rPr>
+          <w:noProof/>
+        </w:rPr>
         <w:drawing>
           <wp:inline distT="0" distB="0" distL="0" distR="0" wp14:anchorId="0C4B871C" wp14:editId="00170699">
             <wp:extent cx="3756660" cy="1821675"/>
@@ -5334,7 +6469,7 @@
                     <pic:cNvPicPr/>
                   </pic:nvPicPr>
                   <pic:blipFill>
-                    <a:blip r:embed="rId10"/>
+                    <a:blip r:embed="rId15"/>
                     <a:stretch>
                       <a:fillRect/>
                     </a:stretch>
@@ -5362,14 +6497,27 @@
       <w:r>
         <w:t xml:space="preserve">Figura </w:t>
       </w:r>
-      <w:fldSimple w:instr=" SEQ Figura \* ARABIC ">
-        <w:r>
-          <w:rPr>
-            <w:noProof/>
-          </w:rPr>
-          <w:t>4</w:t>
-        </w:r>
-      </w:fldSimple>
+      <w:r>
+        <w:fldChar w:fldCharType="begin"/>
+      </w:r>
+      <w:r>
+        <w:instrText xml:space="preserve"> SEQ Figura \* ARABIC </w:instrText>
+      </w:r>
+      <w:r>
+        <w:fldChar w:fldCharType="separate"/>
+      </w:r>
+      <w:r>
+        <w:rPr>
+          <w:noProof/>
+        </w:rPr>
+        <w:t>4</w:t>
+      </w:r>
+      <w:r>
+        <w:rPr>
+          <w:noProof/>
+        </w:rPr>
+        <w:fldChar w:fldCharType="end"/>
+      </w:r>
       <w:r>
         <w:t xml:space="preserve"> Contingut de </w:t>
       </w:r>
@@ -5383,7 +6531,7 @@
       <w:pPr>
         <w:pStyle w:val="Ttol3"/>
       </w:pPr>
-      <w:bookmarkStart w:id="13" w:name="_Toc230361122"/>
+      <w:bookmarkStart w:id="13" w:name="_Toc230888977"/>
       <w:r>
         <w:t>Execució de l’API a partir de binaris (.</w:t>
       </w:r>
@@ -5452,7 +6600,7 @@
       <w:pPr>
         <w:pStyle w:val="Ttol3"/>
       </w:pPr>
-      <w:bookmarkStart w:id="14" w:name="_Toc230361123"/>
+      <w:bookmarkStart w:id="14" w:name="_Toc230888978"/>
       <w:r>
         <w:lastRenderedPageBreak/>
         <w:t xml:space="preserve">Consideracions sobre el procés de </w:t>
@@ -5553,7 +6701,7 @@
       <w:pPr>
         <w:pStyle w:val="Ttol2"/>
       </w:pPr>
-      <w:bookmarkStart w:id="15" w:name="_Toc230361124"/>
+      <w:bookmarkStart w:id="15" w:name="_Toc230888979"/>
       <w:r>
         <w:t>Gestió de la base de dades</w:t>
       </w:r>
@@ -5563,7 +6711,7 @@
       <w:pPr>
         <w:pStyle w:val="Ttol3"/>
       </w:pPr>
-      <w:bookmarkStart w:id="16" w:name="_Toc230361125"/>
+      <w:bookmarkStart w:id="16" w:name="_Toc230888980"/>
       <w:r>
         <w:t xml:space="preserve">Ús del </w:t>
       </w:r>
@@ -5636,7 +6784,7 @@
       <w:pPr>
         <w:pStyle w:val="Ttol3"/>
       </w:pPr>
-      <w:bookmarkStart w:id="17" w:name="_Toc230361126"/>
+      <w:bookmarkStart w:id="17" w:name="_Toc230888981"/>
       <w:r>
         <w:t>Procés de restauració inicial</w:t>
       </w:r>
@@ -5781,7 +6929,7 @@
       <w:pPr>
         <w:pStyle w:val="Ttol3"/>
       </w:pPr>
-      <w:bookmarkStart w:id="18" w:name="_Toc230361127"/>
+      <w:bookmarkStart w:id="18" w:name="_Toc230888982"/>
       <w:r>
         <w:lastRenderedPageBreak/>
         <w:t xml:space="preserve">Persistència de dades amb volums </w:t>
@@ -5861,7 +7009,7 @@
       <w:pPr>
         <w:pStyle w:val="Ttol3"/>
       </w:pPr>
-      <w:bookmarkStart w:id="19" w:name="_Toc230361128"/>
+      <w:bookmarkStart w:id="19" w:name="_Toc230888983"/>
       <w:r>
         <w:t xml:space="preserve">Actualització del </w:t>
       </w:r>
@@ -5989,7 +7137,7 @@
       <w:pPr>
         <w:pStyle w:val="Ttol1"/>
       </w:pPr>
-      <w:bookmarkStart w:id="20" w:name="_Toc230361129"/>
+      <w:bookmarkStart w:id="20" w:name="_Toc230888984"/>
       <w:r>
         <w:t>Responsabilitats</w:t>
       </w:r>
@@ -6008,7 +7156,7 @@
       <w:pPr>
         <w:pStyle w:val="Ttol2"/>
       </w:pPr>
-      <w:bookmarkStart w:id="21" w:name="_Toc230361130"/>
+      <w:bookmarkStart w:id="21" w:name="_Toc230888985"/>
       <w:r>
         <w:t>Modificació del backend</w:t>
       </w:r>
@@ -6223,7 +7371,7 @@
       <w:pPr>
         <w:pStyle w:val="Ttol2"/>
       </w:pPr>
-      <w:bookmarkStart w:id="22" w:name="_Toc230361131"/>
+      <w:bookmarkStart w:id="22" w:name="_Toc230888986"/>
       <w:r>
         <w:t>Actualització de la base de dades</w:t>
       </w:r>
@@ -6352,7 +7500,7 @@
       <w:pPr>
         <w:pStyle w:val="Ttol2"/>
       </w:pPr>
-      <w:bookmarkStart w:id="23" w:name="_Toc230361132"/>
+      <w:bookmarkStart w:id="23" w:name="_Toc230888987"/>
       <w:r>
         <w:t>Preparació i distribució del paquet</w:t>
       </w:r>
@@ -6561,7 +7709,7 @@
       </w:r>
     </w:p>
     <w:p>
-      <w:hyperlink r:id="rId11" w:history="1">
+      <w:hyperlink r:id="rId16" w:history="1">
         <w:r>
           <w:rPr>
             <w:rStyle w:val="Enlla"/>
@@ -6574,7 +7722,7 @@
       <w:pPr>
         <w:pStyle w:val="Ttol1"/>
       </w:pPr>
-      <w:bookmarkStart w:id="24" w:name="_Toc230361133"/>
+      <w:bookmarkStart w:id="24" w:name="_Toc230888988"/>
       <w:r>
         <w:t>Ús</w:t>
       </w:r>
@@ -6608,7 +7756,7 @@
       <w:pPr>
         <w:ind w:firstLine="426"/>
       </w:pPr>
-      <w:hyperlink r:id="rId12" w:history="1">
+      <w:hyperlink r:id="rId17" w:history="1">
         <w:r>
           <w:rPr>
             <w:rStyle w:val="Enlla"/>
@@ -6634,7 +7782,7 @@
       <w:pPr>
         <w:pStyle w:val="Ttol2"/>
       </w:pPr>
-      <w:bookmarkStart w:id="25" w:name="_Toc230361134"/>
+      <w:bookmarkStart w:id="25" w:name="_Toc230888989"/>
       <w:r>
         <w:t>Descripció del projecte amb codi font</w:t>
       </w:r>
@@ -6719,7 +7867,7 @@
       <w:pPr>
         <w:pStyle w:val="Ttol2"/>
       </w:pPr>
-      <w:bookmarkStart w:id="26" w:name="_Toc230361135"/>
+      <w:bookmarkStart w:id="26" w:name="_Toc230888990"/>
       <w:r>
         <w:lastRenderedPageBreak/>
         <w:t>Execució en entorn de desenvolupament</w:t>
@@ -6781,7 +7929,7 @@
       <w:pPr>
         <w:pStyle w:val="Ttol2"/>
       </w:pPr>
-      <w:bookmarkStart w:id="27" w:name="_Toc230361136"/>
+      <w:bookmarkStart w:id="27" w:name="_Toc230888991"/>
       <w:r>
         <w:t>Connexió amb SQL Server</w:t>
       </w:r>
@@ -6855,7 +8003,7 @@
       <w:pPr>
         <w:pStyle w:val="Ttol2"/>
       </w:pPr>
-      <w:bookmarkStart w:id="28" w:name="_Toc230361137"/>
+      <w:bookmarkStart w:id="28" w:name="_Toc230888992"/>
       <w:r>
         <w:t xml:space="preserve">Diferències respecte a l’entorn </w:t>
       </w:r>
@@ -6924,7 +8072,7 @@
       <w:pPr>
         <w:pStyle w:val="Ttol1"/>
       </w:pPr>
-      <w:bookmarkStart w:id="29" w:name="_Toc230361138"/>
+      <w:bookmarkStart w:id="29" w:name="_Toc230888993"/>
       <w:r>
         <w:t>Possibles millores i ampliacions</w:t>
       </w:r>
@@ -6937,7 +8085,7 @@
       <w:pPr>
         <w:pStyle w:val="Ttol2"/>
       </w:pPr>
-      <w:bookmarkStart w:id="30" w:name="_Toc230361139"/>
+      <w:bookmarkStart w:id="30" w:name="_Toc230888994"/>
       <w:r>
         <w:t>Automatització del procés d’inicialització</w:t>
       </w:r>
@@ -6979,7 +8127,7 @@
       <w:pPr>
         <w:pStyle w:val="Ttol2"/>
       </w:pPr>
-      <w:bookmarkStart w:id="31" w:name="_Toc230361140"/>
+      <w:bookmarkStart w:id="31" w:name="_Toc230888995"/>
       <w:r>
         <w:t>Scripts simplificats per a l’alumnat</w:t>
       </w:r>
@@ -7053,7 +8201,7 @@
       <w:pPr>
         <w:pStyle w:val="Ttol2"/>
       </w:pPr>
-      <w:bookmarkStart w:id="32" w:name="_Toc230361141"/>
+      <w:bookmarkStart w:id="32" w:name="_Toc230888996"/>
       <w:r>
         <w:t>Empaquetat en màquina virtual</w:t>
       </w:r>
@@ -7141,7 +8289,7 @@
         <w:pageBreakBefore/>
         <w:ind w:left="357" w:hanging="357"/>
       </w:pPr>
-      <w:bookmarkStart w:id="33" w:name="_Toc230361142"/>
+      <w:bookmarkStart w:id="33" w:name="_Toc230888997"/>
       <w:r>
         <w:lastRenderedPageBreak/>
         <w:t>Annexos</w:t>
@@ -7152,7 +8300,7 @@
       <w:pPr>
         <w:pStyle w:val="Ttol2"/>
       </w:pPr>
-      <w:bookmarkStart w:id="34" w:name="_Toc230361143"/>
+      <w:bookmarkStart w:id="34" w:name="_Toc230888998"/>
       <w:r>
         <w:t>Problemes habituals i solucions</w:t>
       </w:r>
@@ -7162,7 +8310,7 @@
       <w:pPr>
         <w:pStyle w:val="Ttol3"/>
       </w:pPr>
-      <w:bookmarkStart w:id="35" w:name="_Toc230361144"/>
+      <w:bookmarkStart w:id="35" w:name="_Toc230888999"/>
       <w:r>
         <w:t>L’API no s’inicia</w:t>
       </w:r>
@@ -7268,7 +8416,7 @@
       <w:pPr>
         <w:pStyle w:val="Ttol3"/>
       </w:pPr>
-      <w:bookmarkStart w:id="36" w:name="_Toc230361145"/>
+      <w:bookmarkStart w:id="36" w:name="_Toc230889000"/>
       <w:r>
         <w:t>Errors de connexió amb la base de dades</w:t>
       </w:r>
@@ -7383,7 +8531,7 @@
       <w:pPr>
         <w:pStyle w:val="Ttol3"/>
       </w:pPr>
-      <w:bookmarkStart w:id="37" w:name="_Toc230361146"/>
+      <w:bookmarkStart w:id="37" w:name="_Toc230889001"/>
       <w:r>
         <w:t>Problemes en la restauració inicial</w:t>
       </w:r>
@@ -7476,7 +8624,7 @@
       <w:pPr>
         <w:pStyle w:val="Ttol3"/>
       </w:pPr>
-      <w:bookmarkStart w:id="38" w:name="_Toc230361147"/>
+      <w:bookmarkStart w:id="38" w:name="_Toc230889002"/>
       <w:r>
         <w:t>Problemes de ports (1433)</w:t>
       </w:r>
@@ -7561,7 +8709,7 @@
       <w:pPr>
         <w:pStyle w:val="Ttol3"/>
       </w:pPr>
-      <w:bookmarkStart w:id="39" w:name="_Toc230361148"/>
+      <w:bookmarkStart w:id="39" w:name="_Toc230889003"/>
       <w:r>
         <w:t>Estat inconsistent del sistema</w:t>
       </w:r>
@@ -7631,7 +8779,7 @@
       <w:pPr>
         <w:pStyle w:val="Ttol2"/>
       </w:pPr>
-      <w:bookmarkStart w:id="40" w:name="_Toc230361149"/>
+      <w:bookmarkStart w:id="40" w:name="_Toc230889004"/>
       <w:r>
         <w:t xml:space="preserve">Comandes útils de </w:t>
       </w:r>
@@ -7646,7 +8794,7 @@
       <w:pPr>
         <w:pStyle w:val="Ttol3"/>
       </w:pPr>
-      <w:bookmarkStart w:id="41" w:name="_Toc230361150"/>
+      <w:bookmarkStart w:id="41" w:name="_Toc230889005"/>
       <w:r>
         <w:t>Arrancada i parada del sistema</w:t>
       </w:r>
@@ -7687,7 +8835,7 @@
       <w:pPr>
         <w:pStyle w:val="Ttol3"/>
       </w:pPr>
-      <w:bookmarkStart w:id="42" w:name="_Toc230361151"/>
+      <w:bookmarkStart w:id="42" w:name="_Toc230889006"/>
       <w:r>
         <w:t>Reinici de serveis</w:t>
       </w:r>
@@ -7736,7 +8884,7 @@
       <w:pPr>
         <w:pStyle w:val="Ttol3"/>
       </w:pPr>
-      <w:bookmarkStart w:id="43" w:name="_Toc230361152"/>
+      <w:bookmarkStart w:id="43" w:name="_Toc230889007"/>
       <w:r>
         <w:t>Consulta de contenidors</w:t>
       </w:r>
@@ -7769,7 +8917,7 @@
       <w:pPr>
         <w:pStyle w:val="Ttol3"/>
       </w:pPr>
-      <w:bookmarkStart w:id="44" w:name="_Toc230361153"/>
+      <w:bookmarkStart w:id="44" w:name="_Toc230889008"/>
       <w:r>
         <w:t xml:space="preserve">Consulta de </w:t>
       </w:r>
@@ -7848,7 +8996,7 @@
       <w:pPr>
         <w:pStyle w:val="Ttol3"/>
       </w:pPr>
-      <w:bookmarkStart w:id="45" w:name="_Toc230361154"/>
+      <w:bookmarkStart w:id="45" w:name="_Toc230889009"/>
       <w:r>
         <w:t>Execució de comandes dins del contenidor</w:t>
       </w:r>
@@ -7905,7 +9053,7 @@
       <w:pPr>
         <w:pStyle w:val="Ttol3"/>
       </w:pPr>
-      <w:bookmarkStart w:id="46" w:name="_Toc230361155"/>
+      <w:bookmarkStart w:id="46" w:name="_Toc230889010"/>
       <w:r>
         <w:lastRenderedPageBreak/>
         <w:t>Neteja de l’entorn</w:t>
@@ -7972,10 +9120,12 @@
     </w:p>
     <w:p/>
     <w:sectPr>
-      <w:footerReference w:type="default" r:id="rId13"/>
+      <w:footerReference w:type="default" r:id="rId18"/>
       <w:pgSz w:w="11906" w:h="16838"/>
       <w:pgMar w:top="1417" w:right="1701" w:bottom="1417" w:left="1701" w:header="708" w:footer="708" w:gutter="0"/>
+      <w:pgNumType w:start="0"/>
       <w:cols w:space="708"/>
+      <w:titlePg/>
       <w:docGrid w:linePitch="360"/>
     </w:sectPr>
   </w:body>
@@ -13934,6 +15084,39 @@
       <w:shd w:val="clear" w:color="auto" w:fill="E1DFDD"/>
     </w:rPr>
   </w:style>
+  <w:style w:type="paragraph" w:styleId="Senseespaiat">
+    <w:name w:val="No Spacing"/>
+    <w:link w:val="SenseespaiatCar"/>
+    <w:uiPriority w:val="1"/>
+    <w:qFormat/>
+    <w:rsid w:val="00321995"/>
+    <w:pPr>
+      <w:spacing w:after="0" w:line="240" w:lineRule="auto"/>
+    </w:pPr>
+    <w:rPr>
+      <w:rFonts w:eastAsiaTheme="minorEastAsia"/>
+      <w:kern w:val="0"/>
+      <w:sz w:val="22"/>
+      <w:szCs w:val="22"/>
+      <w:lang w:eastAsia="es-ES"/>
+      <w14:ligatures w14:val="none"/>
+    </w:rPr>
+  </w:style>
+  <w:style w:type="character" w:customStyle="1" w:styleId="SenseespaiatCar">
+    <w:name w:val="Sense espaiat Car"/>
+    <w:basedOn w:val="Lletraperdefectedelpargraf"/>
+    <w:link w:val="Senseespaiat"/>
+    <w:uiPriority w:val="1"/>
+    <w:rsid w:val="00321995"/>
+    <w:rPr>
+      <w:rFonts w:eastAsiaTheme="minorEastAsia"/>
+      <w:kern w:val="0"/>
+      <w:sz w:val="22"/>
+      <w:szCs w:val="22"/>
+      <w:lang w:eastAsia="es-ES"/>
+      <w14:ligatures w14:val="none"/>
+    </w:rPr>
+  </w:style>
 </w:styles>
 </file>
 
@@ -14230,4 +15413,23 @@
     </a:ext>
   </a:extLst>
 </a:theme>
+</file>
+
+<file path=customXml/item1.xml><?xml version="1.0" encoding="utf-8"?>
+<CoverPageProperties xmlns="http://schemas.microsoft.com/office/2006/coverPageProps">
+  <PublishDate/>
+  <Abstract>Guia orientada al docente per a desplegar KarmaWebApi mitjançant Docker</Abstract>
+  <CompanyAddress/>
+  <CompanyPhone/>
+  <CompanyFax/>
+  <CompanyEmail>somarrod@alumni.upv.es</CompanyEmail>
+</CoverPageProperties>
+</file>
+
+<file path=customXml/itemProps1.xml><?xml version="1.0" encoding="utf-8"?>
+<ds:datastoreItem xmlns:ds="http://schemas.openxmlformats.org/officeDocument/2006/customXml" ds:itemID="{55AF091B-3C7A-41E3-B477-F2FDAA23CFDA}">
+  <ds:schemaRefs>
+    <ds:schemaRef ds:uri="http://schemas.microsoft.com/office/2006/coverPageProps"/>
+  </ds:schemaRefs>
+</ds:datastoreItem>
 </file>
</xml_diff>